<commit_message>
Add proforma invoice generator with template and export logic
</commit_message>
<xml_diff>
--- a/app/dashboard/PERFORMA-INVOICE-DEFAULT.docx
+++ b/app/dashboard/PERFORMA-INVOICE-DEFAULT.docx
@@ -1,8 +1,8 @@
 
 <file path=word/document.xml><?xml version="1.0" encoding="utf-8"?>
-<w:document xmlns:wpc="http://schemas.microsoft.com/office/word/2010/wordprocessingCanvas" xmlns:cx="http://schemas.microsoft.com/office/drawing/2014/chartex" xmlns:cx1="http://schemas.microsoft.com/office/drawing/2015/9/8/chartex" xmlns:cx2="http://schemas.microsoft.com/office/drawing/2015/10/21/chartex" xmlns:cx3="http://schemas.microsoft.com/office/drawing/2016/5/9/chartex" xmlns:cx4="http://schemas.microsoft.com/office/drawing/2016/5/10/chartex" xmlns:cx5="http://schemas.microsoft.com/office/drawing/2016/5/11/chartex" xmlns:cx6="http://schemas.microsoft.com/office/drawing/2016/5/12/chartex" xmlns:cx7="http://schemas.microsoft.com/office/drawing/2016/5/13/chartex" xmlns:cx8="http://schemas.microsoft.com/office/drawing/2016/5/14/chartex" xmlns:mc="http://schemas.openxmlformats.org/markup-compatibility/2006" xmlns:aink="http://schemas.microsoft.com/office/drawing/2016/ink" xmlns:am3d="http://schemas.microsoft.com/office/drawing/2017/model3d" xmlns:o="urn:schemas-microsoft-com:office:office" xmlns:oel="http://schemas.microsoft.com/office/2019/extlst" xmlns:r="http://schemas.openxmlformats.org/officeDocument/2006/relationships" xmlns:m="http://schemas.openxmlformats.org/officeDocument/2006/math" xmlns:v="urn:schemas-microsoft-com:vml" xmlns:wp14="http://schemas.microsoft.com/office/word/2010/wordprocessingDrawing" xmlns:wp="http://schemas.openxmlformats.org/drawingml/2006/wordprocessingDrawing" xmlns:w10="urn:schemas-microsoft-com:office:word" xmlns:w="http://schemas.openxmlformats.org/wordprocessingml/2006/main" xmlns:w14="http://schemas.microsoft.com/office/word/2010/wordml" xmlns:w15="http://schemas.microsoft.com/office/word/2012/wordml" xmlns:w16cex="http://schemas.microsoft.com/office/word/2018/wordml/cex" xmlns:w16cid="http://schemas.microsoft.com/office/word/2016/wordml/cid" xmlns:w16="http://schemas.microsoft.com/office/word/2018/wordml" xmlns:w16du="http://schemas.microsoft.com/office/word/2023/wordml/word16du" xmlns:w16sdtdh="http://schemas.microsoft.com/office/word/2020/wordml/sdtdatahash" xmlns:w16sdtfl="http://schemas.microsoft.com/office/word/2024/wordml/sdtformatlock" xmlns:w16se="http://schemas.microsoft.com/office/word/2015/wordml/symex" xmlns:wpg="http://schemas.microsoft.com/office/word/2010/wordprocessingGroup" xmlns:wpi="http://schemas.microsoft.com/office/word/2010/wordprocessingInk" xmlns:wne="http://schemas.microsoft.com/office/word/2006/wordml" xmlns:wps="http://schemas.microsoft.com/office/word/2010/wordprocessingShape" mc:Ignorable="w14 w15 w16se w16cid w16 w16cex w16sdtdh w16sdtfl w16du wp14">
+<w:document xmlns:ns1="http://schemas.openxmlformats.org/markup-compatibility/2006" xmlns:ns10="urn:schemas-microsoft-com:vml" xmlns:ns11="urn:schemas-microsoft-com:office:office" xmlns:ns12="urn:schemas-microsoft-com:office:word" xmlns:ns13="http://schemas.microsoft.com/office/drawing/2010/main" xmlns:ns2="http://schemas.microsoft.com/office/word/2010/wordml" xmlns:ns3="http://schemas.openxmlformats.org/drawingml/2006/wordprocessingDrawing" xmlns:ns4="http://schemas.microsoft.com/office/word/2010/wordprocessingDrawing" xmlns:ns5="http://schemas.openxmlformats.org/drawingml/2006/main" xmlns:ns6="http://schemas.microsoft.com/office/word/2010/wordprocessingGroup" xmlns:ns7="http://schemas.openxmlformats.org/drawingml/2006/picture" xmlns:ns9="http://schemas.microsoft.com/office/word/2010/wordprocessingShape" xmlns:r="http://schemas.openxmlformats.org/officeDocument/2006/relationships" xmlns:w="http://schemas.openxmlformats.org/wordprocessingml/2006/main" ns1:Ignorable="w14 w15 w16se w16cid w16 w16cex w16sdtdh w16sdtfl w16du wp14">
   <w:body>
-    <w:p>
+    <w:p ns2:paraId="52557976" ns2:textId="11D4D37A">
       <w:pPr>
         <w:pStyle w:val="BodyText"/>
         <w:rPr>
@@ -13,323 +13,323 @@
         <w:rPr>
           <w:noProof/>
         </w:rPr>
-        <mc:AlternateContent>
-          <mc:Choice Requires="wpg">
+        <ns1:AlternateContent>
+          <ns1:Choice Requires="wpg">
             <w:drawing>
-              <wp:anchor distT="0" distB="0" distL="0" distR="0" simplePos="0" relativeHeight="15730176" behindDoc="0" locked="0" layoutInCell="1" allowOverlap="1" wp14:anchorId="6BD2632B" wp14:editId="0D17B8AB">
-                <wp:simplePos x="0" y="0"/>
-                <wp:positionH relativeFrom="page">
-                  <wp:posOffset>254000</wp:posOffset>
-                </wp:positionH>
-                <wp:positionV relativeFrom="page">
-                  <wp:posOffset>0</wp:posOffset>
-                </wp:positionV>
-                <wp:extent cx="7315200" cy="2504440"/>
-                <wp:effectExtent l="0" t="0" r="0" b="0"/>
-                <wp:wrapNone/>
-                <wp:docPr id="6" name="Group 6"/>
-                <wp:cNvGraphicFramePr>
-                  <a:graphicFrameLocks xmlns:a="http://schemas.openxmlformats.org/drawingml/2006/main"/>
-                </wp:cNvGraphicFramePr>
-                <a:graphic xmlns:a="http://schemas.openxmlformats.org/drawingml/2006/main">
-                  <a:graphicData uri="http://schemas.microsoft.com/office/word/2010/wordprocessingGroup">
-                    <wpg:wgp>
-                      <wpg:cNvGrpSpPr>
-                        <a:grpSpLocks/>
-                      </wpg:cNvGrpSpPr>
-                      <wpg:grpSpPr>
-                        <a:xfrm>
-                          <a:off x="0" y="0"/>
-                          <a:ext cx="7315200" cy="2504440"/>
-                          <a:chOff x="-63500" y="0"/>
-                          <a:chExt cx="7315235" cy="2504440"/>
-                        </a:xfrm>
-                      </wpg:grpSpPr>
-                      <pic:pic xmlns:pic="http://schemas.openxmlformats.org/drawingml/2006/picture">
-                        <pic:nvPicPr>
-                          <pic:cNvPr id="7" name="Image 7"/>
-                          <pic:cNvPicPr/>
-                        </pic:nvPicPr>
-                        <pic:blipFill>
-                          <a:blip r:embed="rId6" cstate="print"/>
-                          <a:stretch>
-                            <a:fillRect/>
-                          </a:stretch>
-                        </pic:blipFill>
-                        <pic:spPr>
-                          <a:xfrm>
-                            <a:off x="0" y="0"/>
-                            <a:ext cx="3771899" cy="2020446"/>
-                          </a:xfrm>
-                          <a:prstGeom prst="rect">
-                            <a:avLst/>
-                          </a:prstGeom>
-                        </pic:spPr>
-                      </pic:pic>
-                      <wps:wsp>
-                        <wps:cNvPr id="8" name="Graphic 8"/>
-                        <wps:cNvSpPr/>
-                        <wps:spPr>
-                          <a:xfrm>
-                            <a:off x="1724408" y="0"/>
-                            <a:ext cx="5205730" cy="1969135"/>
-                          </a:xfrm>
-                          <a:custGeom>
-                            <a:avLst/>
-                            <a:gdLst/>
-                            <a:ahLst/>
-                            <a:cxnLst/>
-                            <a:rect l="l" t="t" r="r" b="b"/>
-                            <a:pathLst>
-                              <a:path w="5205730" h="1969135">
-                                <a:moveTo>
-                                  <a:pt x="0" y="0"/>
-                                </a:moveTo>
-                                <a:lnTo>
-                                  <a:pt x="5205532" y="0"/>
-                                </a:lnTo>
-                                <a:lnTo>
-                                  <a:pt x="5205532" y="1968604"/>
-                                </a:lnTo>
-                                <a:lnTo>
-                                  <a:pt x="0" y="0"/>
-                                </a:lnTo>
-                                <a:close/>
-                              </a:path>
-                            </a:pathLst>
-                          </a:custGeom>
-                          <a:solidFill>
-                            <a:srgbClr val="D9D9D9"/>
-                          </a:solidFill>
-                        </wps:spPr>
-                        <wps:bodyPr wrap="square" lIns="0" tIns="0" rIns="0" bIns="0" rtlCol="0">
-                          <a:prstTxWarp prst="textNoShape">
-                            <a:avLst/>
-                          </a:prstTxWarp>
-                          <a:noAutofit/>
-                        </wps:bodyPr>
-                      </wps:wsp>
-                      <wps:wsp>
-                        <wps:cNvPr id="9" name="Graphic 9"/>
-                        <wps:cNvSpPr/>
-                        <wps:spPr>
-                          <a:xfrm>
-                            <a:off x="2149870" y="0"/>
-                            <a:ext cx="5101590" cy="1929764"/>
-                          </a:xfrm>
-                          <a:custGeom>
-                            <a:avLst/>
-                            <a:gdLst/>
-                            <a:ahLst/>
-                            <a:cxnLst/>
-                            <a:rect l="l" t="t" r="r" b="b"/>
-                            <a:pathLst>
-                              <a:path w="5101590" h="1929764">
-                                <a:moveTo>
-                                  <a:pt x="0" y="0"/>
-                                </a:moveTo>
-                                <a:lnTo>
-                                  <a:pt x="5101576" y="0"/>
-                                </a:lnTo>
-                                <a:lnTo>
-                                  <a:pt x="5101576" y="1929293"/>
-                                </a:lnTo>
-                                <a:lnTo>
-                                  <a:pt x="0" y="0"/>
-                                </a:lnTo>
-                                <a:close/>
-                              </a:path>
-                            </a:pathLst>
-                          </a:custGeom>
-                          <a:solidFill>
-                            <a:srgbClr val="A6A6A6"/>
-                          </a:solidFill>
-                        </wps:spPr>
-                        <wps:bodyPr wrap="square" lIns="0" tIns="0" rIns="0" bIns="0" rtlCol="0">
-                          <a:prstTxWarp prst="textNoShape">
-                            <a:avLst/>
-                          </a:prstTxWarp>
-                          <a:noAutofit/>
-                        </wps:bodyPr>
-                      </wps:wsp>
-                      <wps:wsp>
-                        <wps:cNvPr id="10" name="Graphic 10"/>
-                        <wps:cNvSpPr/>
-                        <wps:spPr>
-                          <a:xfrm>
-                            <a:off x="2911241" y="0"/>
-                            <a:ext cx="4340225" cy="2196465"/>
-                          </a:xfrm>
-                          <a:custGeom>
-                            <a:avLst/>
-                            <a:gdLst/>
-                            <a:ahLst/>
-                            <a:cxnLst/>
-                            <a:rect l="l" t="t" r="r" b="b"/>
-                            <a:pathLst>
-                              <a:path w="4340225" h="2196465">
-                                <a:moveTo>
-                                  <a:pt x="0" y="0"/>
-                                </a:moveTo>
-                                <a:lnTo>
-                                  <a:pt x="4340207" y="0"/>
-                                </a:lnTo>
-                                <a:lnTo>
-                                  <a:pt x="4340207" y="2196282"/>
-                                </a:lnTo>
-                                <a:lnTo>
-                                  <a:pt x="0" y="0"/>
-                                </a:lnTo>
-                                <a:close/>
-                              </a:path>
-                            </a:pathLst>
-                          </a:custGeom>
-                          <a:solidFill>
-                            <a:srgbClr val="37B5FF"/>
-                          </a:solidFill>
-                        </wps:spPr>
-                        <wps:bodyPr wrap="square" lIns="0" tIns="0" rIns="0" bIns="0" rtlCol="0">
-                          <a:prstTxWarp prst="textNoShape">
-                            <a:avLst/>
-                          </a:prstTxWarp>
-                          <a:noAutofit/>
-                        </wps:bodyPr>
-                      </wps:wsp>
-                      <wps:wsp>
-                        <wps:cNvPr id="11" name="Graphic 11"/>
-                        <wps:cNvSpPr/>
-                        <wps:spPr>
-                          <a:xfrm>
-                            <a:off x="3817020" y="0"/>
-                            <a:ext cx="3434715" cy="2504440"/>
-                          </a:xfrm>
-                          <a:custGeom>
-                            <a:avLst/>
-                            <a:gdLst/>
-                            <a:ahLst/>
-                            <a:cxnLst/>
-                            <a:rect l="l" t="t" r="r" b="b"/>
-                            <a:pathLst>
-                              <a:path w="3434715" h="2504440">
-                                <a:moveTo>
-                                  <a:pt x="0" y="0"/>
-                                </a:moveTo>
-                                <a:lnTo>
-                                  <a:pt x="3434427" y="0"/>
-                                </a:lnTo>
-                                <a:lnTo>
-                                  <a:pt x="3434427" y="2504053"/>
-                                </a:lnTo>
-                                <a:lnTo>
-                                  <a:pt x="0" y="0"/>
-                                </a:lnTo>
-                                <a:close/>
-                              </a:path>
-                            </a:pathLst>
-                          </a:custGeom>
-                          <a:solidFill>
-                            <a:srgbClr val="202932"/>
-                          </a:solidFill>
-                        </wps:spPr>
-                        <wps:bodyPr wrap="square" lIns="0" tIns="0" rIns="0" bIns="0" rtlCol="0">
-                          <a:prstTxWarp prst="textNoShape">
-                            <a:avLst/>
-                          </a:prstTxWarp>
-                          <a:noAutofit/>
-                        </wps:bodyPr>
-                      </wps:wsp>
-                      <wps:wsp>
-                        <wps:cNvPr id="12" name="Textbox 12"/>
-                        <wps:cNvSpPr txBox="1"/>
-                        <wps:spPr>
-                          <a:xfrm>
-                            <a:off x="-63500" y="63500"/>
-                            <a:ext cx="7251700" cy="2159000"/>
-                          </a:xfrm>
-                          <a:prstGeom prst="rect">
-                            <a:avLst/>
-                          </a:prstGeom>
-                        </wps:spPr>
-                        <wps:txbx>
+              <ns3:anchor distT="0" distB="0" distL="0" distR="0" simplePos="0" relativeHeight="15730176" behindDoc="0" locked="0" layoutInCell="1" allowOverlap="1" ns4:anchorId="6BD2632B" ns4:editId="0D17B8AB">
+                <ns3:simplePos x="0" y="0"/>
+                <ns3:positionH relativeFrom="page">
+                  <ns3:posOffset>254000</ns3:posOffset>
+                </ns3:positionH>
+                <ns3:positionV relativeFrom="page">
+                  <ns3:posOffset>0</ns3:posOffset>
+                </ns3:positionV>
+                <ns3:extent cx="7315200" cy="2504440"/>
+                <ns3:effectExtent l="0" t="0" r="0" b="0"/>
+                <ns3:wrapNone/>
+                <ns3:docPr id="6" name="Group 6"/>
+                <ns3:cNvGraphicFramePr>
+                  <ns5:graphicFrameLocks/>
+                </ns3:cNvGraphicFramePr>
+                <ns5:graphic>
+                  <ns5:graphicData uri="http://schemas.microsoft.com/office/word/2010/wordprocessingGroup">
+                    <ns6:wgp>
+                      <ns6:cNvGrpSpPr>
+                        <ns5:grpSpLocks/>
+                      </ns6:cNvGrpSpPr>
+                      <ns6:grpSpPr>
+                        <ns5:xfrm>
+                          <ns5:off x="0" y="0"/>
+                          <ns5:ext cx="7315200" cy="2504440"/>
+                          <ns5:chOff x="-63500" y="0"/>
+                          <ns5:chExt cx="7315235" cy="2504440"/>
+                        </ns5:xfrm>
+                      </ns6:grpSpPr>
+                      <ns7:pic>
+                        <ns7:nvPicPr>
+                          <ns7:cNvPr id="7" name="Image 7"/>
+                          <ns7:cNvPicPr/>
+                        </ns7:nvPicPr>
+                        <ns7:blipFill>
+                          <ns5:blip r:embed="rId6" cstate="print"/>
+                          <ns5:stretch>
+                            <ns5:fillRect/>
+                          </ns5:stretch>
+                        </ns7:blipFill>
+                        <ns7:spPr>
+                          <ns5:xfrm>
+                            <ns5:off x="0" y="0"/>
+                            <ns5:ext cx="3771899" cy="2020446"/>
+                          </ns5:xfrm>
+                          <ns5:prstGeom prst="rect">
+                            <ns5:avLst/>
+                          </ns5:prstGeom>
+                        </ns7:spPr>
+                      </ns7:pic>
+                      <ns9:wsp>
+                        <ns9:cNvPr id="8" name="Graphic 8"/>
+                        <ns9:cNvSpPr/>
+                        <ns9:spPr>
+                          <ns5:xfrm>
+                            <ns5:off x="1724408" y="0"/>
+                            <ns5:ext cx="5205730" cy="1969135"/>
+                          </ns5:xfrm>
+                          <ns5:custGeom>
+                            <ns5:avLst/>
+                            <ns5:gdLst/>
+                            <ns5:ahLst/>
+                            <ns5:cxnLst/>
+                            <ns5:rect l="l" t="t" r="r" b="b"/>
+                            <ns5:pathLst>
+                              <ns5:path w="5205730" h="1969135">
+                                <ns5:moveTo>
+                                  <ns5:pt x="0" y="0"/>
+                                </ns5:moveTo>
+                                <ns5:lnTo>
+                                  <ns5:pt x="5205532" y="0"/>
+                                </ns5:lnTo>
+                                <ns5:lnTo>
+                                  <ns5:pt x="5205532" y="1968604"/>
+                                </ns5:lnTo>
+                                <ns5:lnTo>
+                                  <ns5:pt x="0" y="0"/>
+                                </ns5:lnTo>
+                                <ns5:close/>
+                              </ns5:path>
+                            </ns5:pathLst>
+                          </ns5:custGeom>
+                          <ns5:solidFill>
+                            <ns5:srgbClr val="D9D9D9"/>
+                          </ns5:solidFill>
+                        </ns9:spPr>
+                        <ns9:bodyPr wrap="square" lIns="0" tIns="0" rIns="0" bIns="0" rtlCol="0">
+                          <ns5:prstTxWarp prst="textNoShape">
+                            <ns5:avLst/>
+                          </ns5:prstTxWarp>
+                          <ns5:noAutofit/>
+                        </ns9:bodyPr>
+                      </ns9:wsp>
+                      <ns9:wsp>
+                        <ns9:cNvPr id="9" name="Graphic 9"/>
+                        <ns9:cNvSpPr/>
+                        <ns9:spPr>
+                          <ns5:xfrm>
+                            <ns5:off x="2149870" y="0"/>
+                            <ns5:ext cx="5101590" cy="1929764"/>
+                          </ns5:xfrm>
+                          <ns5:custGeom>
+                            <ns5:avLst/>
+                            <ns5:gdLst/>
+                            <ns5:ahLst/>
+                            <ns5:cxnLst/>
+                            <ns5:rect l="l" t="t" r="r" b="b"/>
+                            <ns5:pathLst>
+                              <ns5:path w="5101590" h="1929764">
+                                <ns5:moveTo>
+                                  <ns5:pt x="0" y="0"/>
+                                </ns5:moveTo>
+                                <ns5:lnTo>
+                                  <ns5:pt x="5101576" y="0"/>
+                                </ns5:lnTo>
+                                <ns5:lnTo>
+                                  <ns5:pt x="5101576" y="1929293"/>
+                                </ns5:lnTo>
+                                <ns5:lnTo>
+                                  <ns5:pt x="0" y="0"/>
+                                </ns5:lnTo>
+                                <ns5:close/>
+                              </ns5:path>
+                            </ns5:pathLst>
+                          </ns5:custGeom>
+                          <ns5:solidFill>
+                            <ns5:srgbClr val="A6A6A6"/>
+                          </ns5:solidFill>
+                        </ns9:spPr>
+                        <ns9:bodyPr wrap="square" lIns="0" tIns="0" rIns="0" bIns="0" rtlCol="0">
+                          <ns5:prstTxWarp prst="textNoShape">
+                            <ns5:avLst/>
+                          </ns5:prstTxWarp>
+                          <ns5:noAutofit/>
+                        </ns9:bodyPr>
+                      </ns9:wsp>
+                      <ns9:wsp>
+                        <ns9:cNvPr id="10" name="Graphic 10"/>
+                        <ns9:cNvSpPr/>
+                        <ns9:spPr>
+                          <ns5:xfrm>
+                            <ns5:off x="2911241" y="0"/>
+                            <ns5:ext cx="4340225" cy="2196465"/>
+                          </ns5:xfrm>
+                          <ns5:custGeom>
+                            <ns5:avLst/>
+                            <ns5:gdLst/>
+                            <ns5:ahLst/>
+                            <ns5:cxnLst/>
+                            <ns5:rect l="l" t="t" r="r" b="b"/>
+                            <ns5:pathLst>
+                              <ns5:path w="4340225" h="2196465">
+                                <ns5:moveTo>
+                                  <ns5:pt x="0" y="0"/>
+                                </ns5:moveTo>
+                                <ns5:lnTo>
+                                  <ns5:pt x="4340207" y="0"/>
+                                </ns5:lnTo>
+                                <ns5:lnTo>
+                                  <ns5:pt x="4340207" y="2196282"/>
+                                </ns5:lnTo>
+                                <ns5:lnTo>
+                                  <ns5:pt x="0" y="0"/>
+                                </ns5:lnTo>
+                                <ns5:close/>
+                              </ns5:path>
+                            </ns5:pathLst>
+                          </ns5:custGeom>
+                          <ns5:solidFill>
+                            <ns5:srgbClr val="37B5FF"/>
+                          </ns5:solidFill>
+                        </ns9:spPr>
+                        <ns9:bodyPr wrap="square" lIns="0" tIns="0" rIns="0" bIns="0" rtlCol="0">
+                          <ns5:prstTxWarp prst="textNoShape">
+                            <ns5:avLst/>
+                          </ns5:prstTxWarp>
+                          <ns5:noAutofit/>
+                        </ns9:bodyPr>
+                      </ns9:wsp>
+                      <ns9:wsp>
+                        <ns9:cNvPr id="11" name="Graphic 11"/>
+                        <ns9:cNvSpPr/>
+                        <ns9:spPr>
+                          <ns5:xfrm>
+                            <ns5:off x="3817020" y="0"/>
+                            <ns5:ext cx="3434715" cy="2504440"/>
+                          </ns5:xfrm>
+                          <ns5:custGeom>
+                            <ns5:avLst/>
+                            <ns5:gdLst/>
+                            <ns5:ahLst/>
+                            <ns5:cxnLst/>
+                            <ns5:rect l="l" t="t" r="r" b="b"/>
+                            <ns5:pathLst>
+                              <ns5:path w="3434715" h="2504440">
+                                <ns5:moveTo>
+                                  <ns5:pt x="0" y="0"/>
+                                </ns5:moveTo>
+                                <ns5:lnTo>
+                                  <ns5:pt x="3434427" y="0"/>
+                                </ns5:lnTo>
+                                <ns5:lnTo>
+                                  <ns5:pt x="3434427" y="2504053"/>
+                                </ns5:lnTo>
+                                <ns5:lnTo>
+                                  <ns5:pt x="0" y="0"/>
+                                </ns5:lnTo>
+                                <ns5:close/>
+                              </ns5:path>
+                            </ns5:pathLst>
+                          </ns5:custGeom>
+                          <ns5:solidFill>
+                            <ns5:srgbClr val="202932"/>
+                          </ns5:solidFill>
+                        </ns9:spPr>
+                        <ns9:bodyPr wrap="square" lIns="0" tIns="0" rIns="0" bIns="0" rtlCol="0">
+                          <ns5:prstTxWarp prst="textNoShape">
+                            <ns5:avLst/>
+                          </ns5:prstTxWarp>
+                          <ns5:noAutofit/>
+                        </ns9:bodyPr>
+                      </ns9:wsp>
+                      <ns9:wsp>
+                        <ns9:cNvPr id="12" name="Textbox 12"/>
+                        <ns9:cNvSpPr txBox="1"/>
+                        <ns9:spPr>
+                          <ns5:xfrm>
+                            <ns5:off x="-63500" y="63500"/>
+                            <ns5:ext cx="7251700" cy="2159000"/>
+                          </ns5:xfrm>
+                          <ns5:prstGeom prst="rect">
+                            <ns5:avLst/>
+                          </ns5:prstGeom>
+                        </ns9:spPr>
+                        <ns9:txbx>
                           <w:txbxContent>
-                            <w:p>
+                            <w:p ns2:paraId="42D09ADE" ns2:textId="77777777">
                               <w:pPr>
                                 <w:rPr>
                                   <w:sz w:val="19"/>
                                 </w:rPr>
                               </w:pPr>
                             </w:p>
-                            <w:p>
+                            <w:p ns2:paraId="57D20B3E" ns2:textId="77777777">
                               <w:pPr>
                                 <w:rPr>
                                   <w:sz w:val="19"/>
                                 </w:rPr>
                               </w:pPr>
                             </w:p>
-                            <w:p>
+                            <w:p ns2:paraId="30062623" ns2:textId="77777777">
                               <w:pPr>
                                 <w:rPr>
                                   <w:sz w:val="19"/>
                                 </w:rPr>
                               </w:pPr>
                             </w:p>
-                            <w:p>
+                            <w:p ns2:paraId="76F1D3AB" ns2:textId="77777777">
                               <w:pPr>
                                 <w:rPr>
                                   <w:sz w:val="19"/>
                                 </w:rPr>
                               </w:pPr>
                             </w:p>
-                            <w:p>
+                            <w:p ns2:paraId="365247D9" ns2:textId="77777777">
                               <w:pPr>
                                 <w:rPr>
                                   <w:sz w:val="19"/>
                                 </w:rPr>
                               </w:pPr>
                             </w:p>
-                            <w:p>
+                            <w:p ns2:paraId="0D9B2C12" ns2:textId="77777777">
                               <w:pPr>
                                 <w:rPr>
                                   <w:sz w:val="19"/>
                                 </w:rPr>
                               </w:pPr>
                             </w:p>
-                            <w:p>
+                            <w:p ns2:paraId="14F67905" ns2:textId="77777777">
                               <w:pPr>
                                 <w:rPr>
                                   <w:sz w:val="19"/>
                                 </w:rPr>
                               </w:pPr>
                             </w:p>
-                            <w:p>
+                            <w:p ns2:paraId="4E8D7D6C" ns2:textId="77777777">
                               <w:pPr>
                                 <w:rPr>
                                   <w:sz w:val="19"/>
                                 </w:rPr>
                               </w:pPr>
                             </w:p>
-                            <w:p>
+                            <w:p ns2:paraId="25117273" ns2:textId="77777777">
                               <w:pPr>
                                 <w:rPr>
                                   <w:sz w:val="19"/>
                                 </w:rPr>
                               </w:pPr>
                             </w:p>
-                            <w:p>
+                            <w:p ns2:paraId="296073EE" ns2:textId="77777777">
                               <w:pPr>
                                 <w:rPr>
                                   <w:sz w:val="19"/>
                                 </w:rPr>
                               </w:pPr>
                             </w:p>
-                            <w:p>
+                            <w:p ns2:paraId="744C363E" ns2:textId="77777777">
                               <w:pPr>
                                 <w:rPr>
                                   <w:sz w:val="19"/>
                                 </w:rPr>
                               </w:pPr>
                             </w:p>
-                            <w:p>
+                            <w:p ns2:paraId="2AC9DEFD" ns2:textId="77777777">
                               <w:pPr>
                                 <w:spacing w:before="200"/>
                                 <w:rPr>
@@ -337,7 +337,7 @@
                                 </w:rPr>
                               </w:pPr>
                             </w:p>
-                            <w:p>
+                            <w:p ns2:paraId="1D7C4A22" ns2:textId="6DA79051">
                               <w:pPr>
                                 <w:spacing w:line="297" w:lineRule="auto"/>
                                 <w:ind w:left="1375" w:right="5318" w:hanging="1271"/>
@@ -464,142 +464,142 @@
                               </w:r>
                             </w:p>
                           </w:txbxContent>
-                        </wps:txbx>
-                        <wps:bodyPr wrap="square" lIns="0" tIns="0" rIns="0" bIns="0" rtlCol="0">
-                          <a:noAutofit/>
-                        </wps:bodyPr>
-                      </wps:wsp>
-                    </wpg:wgp>
-                  </a:graphicData>
-                </a:graphic>
-                <wp14:sizeRelH relativeFrom="margin">
-                  <wp14:pctWidth>0</wp14:pctWidth>
-                </wp14:sizeRelH>
-              </wp:anchor>
+                        </ns9:txbx>
+                        <ns9:bodyPr wrap="square" lIns="0" tIns="0" rIns="0" bIns="0" rtlCol="0">
+                          <ns5:noAutofit/>
+                        </ns9:bodyPr>
+                      </ns9:wsp>
+                    </ns6:wgp>
+                  </ns5:graphicData>
+                </ns5:graphic>
+                <ns4:sizeRelH relativeFrom="margin">
+                  <ns4:pctWidth>0</ns4:pctWidth>
+                </ns4:sizeRelH>
+              </ns3:anchor>
             </w:drawing>
-          </mc:Choice>
-          <mc:Fallback>
+          </ns1:Choice>
+          <ns1:Fallback>
             <w:pict>
-              <v:group w14:anchorId="6BD2632B" id="Group 6" o:spid="_x0000_s1026" style="position:absolute;margin-left:20pt;margin-top:0;width:8in;height:197.2pt;z-index:15730176;mso-wrap-distance-left:0;mso-wrap-distance-right:0;mso-position-horizontal-relative:page;mso-position-vertical-relative:page;mso-width-relative:margin" coordorigin="-635" coordsize="73152,25044" o:gfxdata="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">
-                <v:shapetype id="_x0000_t75" coordsize="21600,21600" o:spt="75" o:preferrelative="t" path="m@4@5l@4@11@9@11@9@5xe" filled="f" stroked="f">
-                  <v:stroke joinstyle="miter"/>
-                  <v:formulas>
-                    <v:f eqn="if lineDrawn pixelLineWidth 0"/>
-                    <v:f eqn="sum @0 1 0"/>
-                    <v:f eqn="sum 0 0 @1"/>
-                    <v:f eqn="prod @2 1 2"/>
-                    <v:f eqn="prod @3 21600 pixelWidth"/>
-                    <v:f eqn="prod @3 21600 pixelHeight"/>
-                    <v:f eqn="sum @0 0 1"/>
-                    <v:f eqn="prod @6 1 2"/>
-                    <v:f eqn="prod @7 21600 pixelWidth"/>
-                    <v:f eqn="sum @8 21600 0"/>
-                    <v:f eqn="prod @7 21600 pixelHeight"/>
-                    <v:f eqn="sum @10 21600 0"/>
-                  </v:formulas>
-                  <v:path o:extrusionok="f" gradientshapeok="t" o:connecttype="rect"/>
-                  <o:lock v:ext="edit" aspectratio="t"/>
-                </v:shapetype>
-                <v:shape id="Image 7" o:spid="_x0000_s1027" type="#_x0000_t75" style="position:absolute;width:37718;height:20204;visibility:visible;mso-wrap-style:square" o:gfxdata="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">
-                  <v:imagedata r:id="rId7" o:title=""/>
-                </v:shape>
-                <v:shape id="Graphic 8" o:spid="_x0000_s1028" style="position:absolute;left:17244;width:52057;height:19691;visibility:visible;mso-wrap-style:square;v-text-anchor:top" coordsize="5205730,1969135" o:gfxdata="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" path="m,l5205532,r,1968604l,xe" fillcolor="#d9d9d9" stroked="f">
-                  <v:path arrowok="t"/>
-                </v:shape>
-                <v:shape id="Graphic 9" o:spid="_x0000_s1029" style="position:absolute;left:21498;width:51016;height:19297;visibility:visible;mso-wrap-style:square;v-text-anchor:top" coordsize="5101590,1929764" o:gfxdata="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" path="m,l5101576,r,1929293l,xe" fillcolor="#a6a6a6" stroked="f">
-                  <v:path arrowok="t"/>
-                </v:shape>
-                <v:shape id="Graphic 10" o:spid="_x0000_s1030" style="position:absolute;left:29112;width:43402;height:21964;visibility:visible;mso-wrap-style:square;v-text-anchor:top" coordsize="4340225,2196465" o:gfxdata="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" path="m,l4340207,r,2196282l,xe" fillcolor="#37b5ff" stroked="f">
-                  <v:path arrowok="t"/>
-                </v:shape>
-                <v:shape id="Graphic 11" o:spid="_x0000_s1031" style="position:absolute;left:38170;width:34347;height:25044;visibility:visible;mso-wrap-style:square;v-text-anchor:top" coordsize="3434715,2504440" o:gfxdata="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" path="m,l3434427,r,2504053l,xe" fillcolor="#202932" stroked="f">
-                  <v:path arrowok="t"/>
-                </v:shape>
-                <v:shapetype id="_x0000_t202" coordsize="21600,21600" o:spt="202" path="m,l,21600r21600,l21600,xe">
-                  <v:stroke joinstyle="miter"/>
-                  <v:path gradientshapeok="t" o:connecttype="rect"/>
-                </v:shapetype>
-                <v:shape id="Textbox 12" o:spid="_x0000_s1032" type="#_x0000_t202" style="position:absolute;left:-635;top:635;width:72517;height:21590;visibility:visible;mso-wrap-style:square;v-text-anchor:top" o:gfxdata="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" filled="f" stroked="f">
-                  <v:textbox inset="0,0,0,0">
+              <ns10:group ns2:anchorId="6BD2632B" id="Group 6" ns11:spid="_x0000_s1026" style="position:absolute;margin-left:20pt;margin-top:0;width:8in;height:197.2pt;z-index:15730176;mso-wrap-distance-left:0;mso-wrap-distance-right:0;mso-position-horizontal-relative:page;mso-position-vertical-relative:page;mso-width-relative:margin" coordorigin="-635" coordsize="73152,25044" ns11:gfxdata="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">
+                <ns10:shapetype id="_x0000_t75" coordsize="21600,21600" ns11:spt="75" ns11:preferrelative="t" path="m@4@5l@4@11@9@11@9@5xe" filled="f" stroked="f">
+                  <ns10:stroke joinstyle="miter"/>
+                  <ns10:formulas>
+                    <ns10:f eqn="if lineDrawn pixelLineWidth 0"/>
+                    <ns10:f eqn="sum @0 1 0"/>
+                    <ns10:f eqn="sum 0 0 @1"/>
+                    <ns10:f eqn="prod @2 1 2"/>
+                    <ns10:f eqn="prod @3 21600 pixelWidth"/>
+                    <ns10:f eqn="prod @3 21600 pixelHeight"/>
+                    <ns10:f eqn="sum @0 0 1"/>
+                    <ns10:f eqn="prod @6 1 2"/>
+                    <ns10:f eqn="prod @7 21600 pixelWidth"/>
+                    <ns10:f eqn="sum @8 21600 0"/>
+                    <ns10:f eqn="prod @7 21600 pixelHeight"/>
+                    <ns10:f eqn="sum @10 21600 0"/>
+                  </ns10:formulas>
+                  <ns10:path ns11:extrusionok="f" gradientshapeok="t" ns11:connecttype="rect"/>
+                  <ns11:lock ns10:ext="edit" aspectratio="t"/>
+                </ns10:shapetype>
+                <ns10:shape id="Image 7" ns11:spid="_x0000_s1027" type="#_x0000_t75" style="position:absolute;width:37718;height:20204;visibility:visible;mso-wrap-style:square" ns11:gfxdata="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">
+                  <ns10:imagedata r:id="rId7" ns11:title=""/>
+                </ns10:shape>
+                <ns10:shape id="Graphic 8" ns11:spid="_x0000_s1028" style="position:absolute;left:17244;width:52057;height:19691;visibility:visible;mso-wrap-style:square;v-text-anchor:top" coordsize="5205730,1969135" ns11:gfxdata="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" path="m,l5205532,r,1968604l,xe" fillcolor="#d9d9d9" stroked="f">
+                  <ns10:path arrowok="t"/>
+                </ns10:shape>
+                <ns10:shape id="Graphic 9" ns11:spid="_x0000_s1029" style="position:absolute;left:21498;width:51016;height:19297;visibility:visible;mso-wrap-style:square;v-text-anchor:top" coordsize="5101590,1929764" ns11:gfxdata="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" path="m,l5101576,r,1929293l,xe" fillcolor="#a6a6a6" stroked="f">
+                  <ns10:path arrowok="t"/>
+                </ns10:shape>
+                <ns10:shape id="Graphic 10" ns11:spid="_x0000_s1030" style="position:absolute;left:29112;width:43402;height:21964;visibility:visible;mso-wrap-style:square;v-text-anchor:top" coordsize="4340225,2196465" ns11:gfxdata="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" path="m,l4340207,r,2196282l,xe" fillcolor="#37b5ff" stroked="f">
+                  <ns10:path arrowok="t"/>
+                </ns10:shape>
+                <ns10:shape id="Graphic 11" ns11:spid="_x0000_s1031" style="position:absolute;left:38170;width:34347;height:25044;visibility:visible;mso-wrap-style:square;v-text-anchor:top" coordsize="3434715,2504440" ns11:gfxdata="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" path="m,l3434427,r,2504053l,xe" fillcolor="#202932" stroked="f">
+                  <ns10:path arrowok="t"/>
+                </ns10:shape>
+                <ns10:shapetype id="_x0000_t202" coordsize="21600,21600" ns11:spt="202" path="m,l,21600r21600,l21600,xe">
+                  <ns10:stroke joinstyle="miter"/>
+                  <ns10:path gradientshapeok="t" ns11:connecttype="rect"/>
+                </ns10:shapetype>
+                <ns10:shape id="Textbox 12" ns11:spid="_x0000_s1032" type="#_x0000_t202" style="position:absolute;left:-635;top:635;width:72517;height:21590;visibility:visible;mso-wrap-style:square;v-text-anchor:top" ns11:gfxdata="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" filled="f" stroked="f">
+                  <ns10:textbox inset="0,0,0,0">
                     <w:txbxContent>
-                      <w:p>
+                      <w:p ns2:paraId="42D09ADE" ns2:textId="77777777">
                         <w:pPr>
                           <w:rPr>
                             <w:sz w:val="19"/>
                           </w:rPr>
                         </w:pPr>
                       </w:p>
-                      <w:p>
+                      <w:p ns2:paraId="57D20B3E" ns2:textId="77777777">
                         <w:pPr>
                           <w:rPr>
                             <w:sz w:val="19"/>
                           </w:rPr>
                         </w:pPr>
                       </w:p>
-                      <w:p>
+                      <w:p ns2:paraId="30062623" ns2:textId="77777777">
                         <w:pPr>
                           <w:rPr>
                             <w:sz w:val="19"/>
                           </w:rPr>
                         </w:pPr>
                       </w:p>
-                      <w:p>
+                      <w:p ns2:paraId="76F1D3AB" ns2:textId="77777777">
                         <w:pPr>
                           <w:rPr>
                             <w:sz w:val="19"/>
                           </w:rPr>
                         </w:pPr>
                       </w:p>
-                      <w:p>
+                      <w:p ns2:paraId="365247D9" ns2:textId="77777777">
                         <w:pPr>
                           <w:rPr>
                             <w:sz w:val="19"/>
                           </w:rPr>
                         </w:pPr>
                       </w:p>
-                      <w:p>
+                      <w:p ns2:paraId="0D9B2C12" ns2:textId="77777777">
                         <w:pPr>
                           <w:rPr>
                             <w:sz w:val="19"/>
                           </w:rPr>
                         </w:pPr>
                       </w:p>
-                      <w:p>
+                      <w:p ns2:paraId="14F67905" ns2:textId="77777777">
                         <w:pPr>
                           <w:rPr>
                             <w:sz w:val="19"/>
                           </w:rPr>
                         </w:pPr>
                       </w:p>
-                      <w:p>
+                      <w:p ns2:paraId="4E8D7D6C" ns2:textId="77777777">
                         <w:pPr>
                           <w:rPr>
                             <w:sz w:val="19"/>
                           </w:rPr>
                         </w:pPr>
                       </w:p>
-                      <w:p>
+                      <w:p ns2:paraId="25117273" ns2:textId="77777777">
                         <w:pPr>
                           <w:rPr>
                             <w:sz w:val="19"/>
                           </w:rPr>
                         </w:pPr>
                       </w:p>
-                      <w:p>
+                      <w:p ns2:paraId="296073EE" ns2:textId="77777777">
                         <w:pPr>
                           <w:rPr>
                             <w:sz w:val="19"/>
                           </w:rPr>
                         </w:pPr>
                       </w:p>
-                      <w:p>
+                      <w:p ns2:paraId="744C363E" ns2:textId="77777777">
                         <w:pPr>
                           <w:rPr>
                             <w:sz w:val="19"/>
                           </w:rPr>
                         </w:pPr>
                       </w:p>
-                      <w:p>
+                      <w:p ns2:paraId="2AC9DEFD" ns2:textId="77777777">
                         <w:pPr>
                           <w:spacing w:before="200"/>
                           <w:rPr>
@@ -607,7 +607,7 @@
                           </w:rPr>
                         </w:pPr>
                       </w:p>
-                      <w:p>
+                      <w:p ns2:paraId="1D7C4A22" ns2:textId="6DA79051">
                         <w:pPr>
                           <w:spacing w:line="297" w:lineRule="auto"/>
                           <w:ind w:left="1375" w:right="5318" w:hanging="1271"/>
@@ -734,257 +734,257 @@
                         </w:r>
                       </w:p>
                     </w:txbxContent>
-                  </v:textbox>
-                </v:shape>
-                <w10:wrap anchorx="page" anchory="page"/>
-              </v:group>
+                  </ns10:textbox>
+                </ns10:shape>
+                <ns12:wrap anchorx="page" anchory="page"/>
+              </ns10:group>
             </w:pict>
-          </mc:Fallback>
-        </mc:AlternateContent>
+          </ns1:Fallback>
+        </ns1:AlternateContent>
       </w:r>
       <w:r>
         <w:rPr>
           <w:noProof/>
         </w:rPr>
-        <mc:AlternateContent>
-          <mc:Choice Requires="wpg">
+        <ns1:AlternateContent>
+          <ns1:Choice Requires="wpg">
             <w:drawing>
-              <wp:anchor distT="0" distB="0" distL="0" distR="0" simplePos="0" relativeHeight="15728640" behindDoc="0" locked="0" layoutInCell="1" allowOverlap="1" wp14:anchorId="32CE4B56" wp14:editId="2CC1A2DF">
-                <wp:simplePos x="0" y="0"/>
-                <wp:positionH relativeFrom="page">
-                  <wp:posOffset>0</wp:posOffset>
-                </wp:positionH>
-                <wp:positionV relativeFrom="page">
-                  <wp:posOffset>9872185</wp:posOffset>
-                </wp:positionV>
-                <wp:extent cx="5774055" cy="824865"/>
-                <wp:effectExtent l="0" t="0" r="0" b="0"/>
-                <wp:wrapNone/>
-                <wp:docPr id="1" name="Group 1"/>
-                <wp:cNvGraphicFramePr>
-                  <a:graphicFrameLocks xmlns:a="http://schemas.openxmlformats.org/drawingml/2006/main"/>
-                </wp:cNvGraphicFramePr>
-                <a:graphic xmlns:a="http://schemas.openxmlformats.org/drawingml/2006/main">
-                  <a:graphicData uri="http://schemas.microsoft.com/office/word/2010/wordprocessingGroup">
-                    <wpg:wgp>
-                      <wpg:cNvGrpSpPr>
-                        <a:grpSpLocks/>
-                      </wpg:cNvGrpSpPr>
-                      <wpg:grpSpPr>
-                        <a:xfrm>
-                          <a:off x="0" y="0"/>
-                          <a:ext cx="5774055" cy="824865"/>
-                          <a:chOff x="0" y="0"/>
-                          <a:chExt cx="5774055" cy="824865"/>
-                        </a:xfrm>
-                      </wpg:grpSpPr>
-                      <wps:wsp>
-                        <wps:cNvPr id="2" name="Graphic 2"/>
-                        <wps:cNvSpPr/>
-                        <wps:spPr>
-                          <a:xfrm>
-                            <a:off x="3057300" y="347219"/>
-                            <a:ext cx="2717165" cy="477520"/>
-                          </a:xfrm>
-                          <a:custGeom>
-                            <a:avLst/>
-                            <a:gdLst/>
-                            <a:ahLst/>
-                            <a:cxnLst/>
-                            <a:rect l="l" t="t" r="r" b="b"/>
-                            <a:pathLst>
-                              <a:path w="2717165" h="477520">
-                                <a:moveTo>
-                                  <a:pt x="1358395" y="0"/>
-                                </a:moveTo>
-                                <a:lnTo>
-                                  <a:pt x="2716741" y="477170"/>
-                                </a:lnTo>
-                                <a:lnTo>
-                                  <a:pt x="0" y="477170"/>
-                                </a:lnTo>
-                                <a:lnTo>
-                                  <a:pt x="1358395" y="0"/>
-                                </a:lnTo>
-                                <a:close/>
-                              </a:path>
-                            </a:pathLst>
-                          </a:custGeom>
-                          <a:solidFill>
-                            <a:srgbClr val="D9D9D9"/>
-                          </a:solidFill>
-                        </wps:spPr>
-                        <wps:bodyPr wrap="square" lIns="0" tIns="0" rIns="0" bIns="0" rtlCol="0">
-                          <a:prstTxWarp prst="textNoShape">
-                            <a:avLst/>
-                          </a:prstTxWarp>
-                          <a:noAutofit/>
-                        </wps:bodyPr>
-                      </wps:wsp>
-                      <wps:wsp>
-                        <wps:cNvPr id="3" name="Graphic 3"/>
-                        <wps:cNvSpPr/>
-                        <wps:spPr>
-                          <a:xfrm>
-                            <a:off x="1536726" y="215079"/>
-                            <a:ext cx="3469640" cy="609600"/>
-                          </a:xfrm>
-                          <a:custGeom>
-                            <a:avLst/>
-                            <a:gdLst/>
-                            <a:ahLst/>
-                            <a:cxnLst/>
-                            <a:rect l="l" t="t" r="r" b="b"/>
-                            <a:pathLst>
-                              <a:path w="3469640" h="609600">
-                                <a:moveTo>
-                                  <a:pt x="1734539" y="0"/>
-                                </a:moveTo>
-                                <a:lnTo>
-                                  <a:pt x="3469085" y="609310"/>
-                                </a:lnTo>
-                                <a:lnTo>
-                                  <a:pt x="0" y="609310"/>
-                                </a:lnTo>
-                                <a:lnTo>
-                                  <a:pt x="1734539" y="0"/>
-                                </a:lnTo>
-                                <a:close/>
-                              </a:path>
-                            </a:pathLst>
-                          </a:custGeom>
-                          <a:solidFill>
-                            <a:srgbClr val="A6A6A6"/>
-                          </a:solidFill>
-                        </wps:spPr>
-                        <wps:bodyPr wrap="square" lIns="0" tIns="0" rIns="0" bIns="0" rtlCol="0">
-                          <a:prstTxWarp prst="textNoShape">
-                            <a:avLst/>
-                          </a:prstTxWarp>
-                          <a:noAutofit/>
-                        </wps:bodyPr>
-                      </wps:wsp>
-                      <wps:wsp>
-                        <wps:cNvPr id="4" name="Graphic 4"/>
-                        <wps:cNvSpPr/>
-                        <wps:spPr>
-                          <a:xfrm>
-                            <a:off x="0" y="113"/>
-                            <a:ext cx="4085590" cy="824865"/>
-                          </a:xfrm>
-                          <a:custGeom>
-                            <a:avLst/>
-                            <a:gdLst/>
-                            <a:ahLst/>
-                            <a:cxnLst/>
-                            <a:rect l="l" t="t" r="r" b="b"/>
-                            <a:pathLst>
-                              <a:path w="4085590" h="824865">
-                                <a:moveTo>
-                                  <a:pt x="1739055" y="0"/>
-                                </a:moveTo>
-                                <a:lnTo>
-                                  <a:pt x="4085541" y="824276"/>
-                                </a:lnTo>
-                                <a:lnTo>
-                                  <a:pt x="0" y="824276"/>
-                                </a:lnTo>
-                                <a:lnTo>
-                                  <a:pt x="0" y="610910"/>
-                                </a:lnTo>
-                                <a:lnTo>
-                                  <a:pt x="1739055" y="0"/>
-                                </a:lnTo>
-                                <a:close/>
-                              </a:path>
-                            </a:pathLst>
-                          </a:custGeom>
-                          <a:solidFill>
-                            <a:srgbClr val="37B5FF"/>
-                          </a:solidFill>
-                        </wps:spPr>
-                        <wps:bodyPr wrap="square" lIns="0" tIns="0" rIns="0" bIns="0" rtlCol="0">
-                          <a:prstTxWarp prst="textNoShape">
-                            <a:avLst/>
-                          </a:prstTxWarp>
-                          <a:noAutofit/>
-                        </wps:bodyPr>
-                      </wps:wsp>
-                      <wps:wsp>
-                        <wps:cNvPr id="5" name="Graphic 5"/>
-                        <wps:cNvSpPr/>
-                        <wps:spPr>
-                          <a:xfrm>
-                            <a:off x="0" y="0"/>
-                            <a:ext cx="2365375" cy="824865"/>
-                          </a:xfrm>
-                          <a:custGeom>
-                            <a:avLst/>
-                            <a:gdLst/>
-                            <a:ahLst/>
-                            <a:cxnLst/>
-                            <a:rect l="l" t="t" r="r" b="b"/>
-                            <a:pathLst>
-                              <a:path w="2365375" h="824865">
-                                <a:moveTo>
-                                  <a:pt x="361847" y="0"/>
-                                </a:moveTo>
-                                <a:lnTo>
-                                  <a:pt x="2365154" y="824390"/>
-                                </a:lnTo>
-                                <a:lnTo>
-                                  <a:pt x="0" y="824390"/>
-                                </a:lnTo>
-                                <a:lnTo>
-                                  <a:pt x="0" y="148912"/>
-                                </a:lnTo>
-                                <a:lnTo>
-                                  <a:pt x="361847" y="0"/>
-                                </a:lnTo>
-                                <a:close/>
-                              </a:path>
-                            </a:pathLst>
-                          </a:custGeom>
-                          <a:solidFill>
-                            <a:srgbClr val="202932"/>
-                          </a:solidFill>
-                        </wps:spPr>
-                        <wps:bodyPr wrap="square" lIns="0" tIns="0" rIns="0" bIns="0" rtlCol="0">
-                          <a:prstTxWarp prst="textNoShape">
-                            <a:avLst/>
-                          </a:prstTxWarp>
-                          <a:noAutofit/>
-                        </wps:bodyPr>
-                      </wps:wsp>
-                    </wpg:wgp>
-                  </a:graphicData>
-                </a:graphic>
-              </wp:anchor>
+              <ns3:anchor distT="0" distB="0" distL="0" distR="0" simplePos="0" relativeHeight="15728640" behindDoc="0" locked="0" layoutInCell="1" allowOverlap="1" ns4:anchorId="32CE4B56" ns4:editId="2CC1A2DF">
+                <ns3:simplePos x="0" y="0"/>
+                <ns3:positionH relativeFrom="page">
+                  <ns3:posOffset>0</ns3:posOffset>
+                </ns3:positionH>
+                <ns3:positionV relativeFrom="page">
+                  <ns3:posOffset>9872185</ns3:posOffset>
+                </ns3:positionV>
+                <ns3:extent cx="5774055" cy="824865"/>
+                <ns3:effectExtent l="0" t="0" r="0" b="0"/>
+                <ns3:wrapNone/>
+                <ns3:docPr id="1" name="Group 1"/>
+                <ns3:cNvGraphicFramePr>
+                  <ns5:graphicFrameLocks/>
+                </ns3:cNvGraphicFramePr>
+                <ns5:graphic>
+                  <ns5:graphicData uri="http://schemas.microsoft.com/office/word/2010/wordprocessingGroup">
+                    <ns6:wgp>
+                      <ns6:cNvGrpSpPr>
+                        <ns5:grpSpLocks/>
+                      </ns6:cNvGrpSpPr>
+                      <ns6:grpSpPr>
+                        <ns5:xfrm>
+                          <ns5:off x="0" y="0"/>
+                          <ns5:ext cx="5774055" cy="824865"/>
+                          <ns5:chOff x="0" y="0"/>
+                          <ns5:chExt cx="5774055" cy="824865"/>
+                        </ns5:xfrm>
+                      </ns6:grpSpPr>
+                      <ns9:wsp>
+                        <ns9:cNvPr id="2" name="Graphic 2"/>
+                        <ns9:cNvSpPr/>
+                        <ns9:spPr>
+                          <ns5:xfrm>
+                            <ns5:off x="3057300" y="347219"/>
+                            <ns5:ext cx="2717165" cy="477520"/>
+                          </ns5:xfrm>
+                          <ns5:custGeom>
+                            <ns5:avLst/>
+                            <ns5:gdLst/>
+                            <ns5:ahLst/>
+                            <ns5:cxnLst/>
+                            <ns5:rect l="l" t="t" r="r" b="b"/>
+                            <ns5:pathLst>
+                              <ns5:path w="2717165" h="477520">
+                                <ns5:moveTo>
+                                  <ns5:pt x="1358395" y="0"/>
+                                </ns5:moveTo>
+                                <ns5:lnTo>
+                                  <ns5:pt x="2716741" y="477170"/>
+                                </ns5:lnTo>
+                                <ns5:lnTo>
+                                  <ns5:pt x="0" y="477170"/>
+                                </ns5:lnTo>
+                                <ns5:lnTo>
+                                  <ns5:pt x="1358395" y="0"/>
+                                </ns5:lnTo>
+                                <ns5:close/>
+                              </ns5:path>
+                            </ns5:pathLst>
+                          </ns5:custGeom>
+                          <ns5:solidFill>
+                            <ns5:srgbClr val="D9D9D9"/>
+                          </ns5:solidFill>
+                        </ns9:spPr>
+                        <ns9:bodyPr wrap="square" lIns="0" tIns="0" rIns="0" bIns="0" rtlCol="0">
+                          <ns5:prstTxWarp prst="textNoShape">
+                            <ns5:avLst/>
+                          </ns5:prstTxWarp>
+                          <ns5:noAutofit/>
+                        </ns9:bodyPr>
+                      </ns9:wsp>
+                      <ns9:wsp>
+                        <ns9:cNvPr id="3" name="Graphic 3"/>
+                        <ns9:cNvSpPr/>
+                        <ns9:spPr>
+                          <ns5:xfrm>
+                            <ns5:off x="1536726" y="215079"/>
+                            <ns5:ext cx="3469640" cy="609600"/>
+                          </ns5:xfrm>
+                          <ns5:custGeom>
+                            <ns5:avLst/>
+                            <ns5:gdLst/>
+                            <ns5:ahLst/>
+                            <ns5:cxnLst/>
+                            <ns5:rect l="l" t="t" r="r" b="b"/>
+                            <ns5:pathLst>
+                              <ns5:path w="3469640" h="609600">
+                                <ns5:moveTo>
+                                  <ns5:pt x="1734539" y="0"/>
+                                </ns5:moveTo>
+                                <ns5:lnTo>
+                                  <ns5:pt x="3469085" y="609310"/>
+                                </ns5:lnTo>
+                                <ns5:lnTo>
+                                  <ns5:pt x="0" y="609310"/>
+                                </ns5:lnTo>
+                                <ns5:lnTo>
+                                  <ns5:pt x="1734539" y="0"/>
+                                </ns5:lnTo>
+                                <ns5:close/>
+                              </ns5:path>
+                            </ns5:pathLst>
+                          </ns5:custGeom>
+                          <ns5:solidFill>
+                            <ns5:srgbClr val="A6A6A6"/>
+                          </ns5:solidFill>
+                        </ns9:spPr>
+                        <ns9:bodyPr wrap="square" lIns="0" tIns="0" rIns="0" bIns="0" rtlCol="0">
+                          <ns5:prstTxWarp prst="textNoShape">
+                            <ns5:avLst/>
+                          </ns5:prstTxWarp>
+                          <ns5:noAutofit/>
+                        </ns9:bodyPr>
+                      </ns9:wsp>
+                      <ns9:wsp>
+                        <ns9:cNvPr id="4" name="Graphic 4"/>
+                        <ns9:cNvSpPr/>
+                        <ns9:spPr>
+                          <ns5:xfrm>
+                            <ns5:off x="0" y="113"/>
+                            <ns5:ext cx="4085590" cy="824865"/>
+                          </ns5:xfrm>
+                          <ns5:custGeom>
+                            <ns5:avLst/>
+                            <ns5:gdLst/>
+                            <ns5:ahLst/>
+                            <ns5:cxnLst/>
+                            <ns5:rect l="l" t="t" r="r" b="b"/>
+                            <ns5:pathLst>
+                              <ns5:path w="4085590" h="824865">
+                                <ns5:moveTo>
+                                  <ns5:pt x="1739055" y="0"/>
+                                </ns5:moveTo>
+                                <ns5:lnTo>
+                                  <ns5:pt x="4085541" y="824276"/>
+                                </ns5:lnTo>
+                                <ns5:lnTo>
+                                  <ns5:pt x="0" y="824276"/>
+                                </ns5:lnTo>
+                                <ns5:lnTo>
+                                  <ns5:pt x="0" y="610910"/>
+                                </ns5:lnTo>
+                                <ns5:lnTo>
+                                  <ns5:pt x="1739055" y="0"/>
+                                </ns5:lnTo>
+                                <ns5:close/>
+                              </ns5:path>
+                            </ns5:pathLst>
+                          </ns5:custGeom>
+                          <ns5:solidFill>
+                            <ns5:srgbClr val="37B5FF"/>
+                          </ns5:solidFill>
+                        </ns9:spPr>
+                        <ns9:bodyPr wrap="square" lIns="0" tIns="0" rIns="0" bIns="0" rtlCol="0">
+                          <ns5:prstTxWarp prst="textNoShape">
+                            <ns5:avLst/>
+                          </ns5:prstTxWarp>
+                          <ns5:noAutofit/>
+                        </ns9:bodyPr>
+                      </ns9:wsp>
+                      <ns9:wsp>
+                        <ns9:cNvPr id="5" name="Graphic 5"/>
+                        <ns9:cNvSpPr/>
+                        <ns9:spPr>
+                          <ns5:xfrm>
+                            <ns5:off x="0" y="0"/>
+                            <ns5:ext cx="2365375" cy="824865"/>
+                          </ns5:xfrm>
+                          <ns5:custGeom>
+                            <ns5:avLst/>
+                            <ns5:gdLst/>
+                            <ns5:ahLst/>
+                            <ns5:cxnLst/>
+                            <ns5:rect l="l" t="t" r="r" b="b"/>
+                            <ns5:pathLst>
+                              <ns5:path w="2365375" h="824865">
+                                <ns5:moveTo>
+                                  <ns5:pt x="361847" y="0"/>
+                                </ns5:moveTo>
+                                <ns5:lnTo>
+                                  <ns5:pt x="2365154" y="824390"/>
+                                </ns5:lnTo>
+                                <ns5:lnTo>
+                                  <ns5:pt x="0" y="824390"/>
+                                </ns5:lnTo>
+                                <ns5:lnTo>
+                                  <ns5:pt x="0" y="148912"/>
+                                </ns5:lnTo>
+                                <ns5:lnTo>
+                                  <ns5:pt x="361847" y="0"/>
+                                </ns5:lnTo>
+                                <ns5:close/>
+                              </ns5:path>
+                            </ns5:pathLst>
+                          </ns5:custGeom>
+                          <ns5:solidFill>
+                            <ns5:srgbClr val="202932"/>
+                          </ns5:solidFill>
+                        </ns9:spPr>
+                        <ns9:bodyPr wrap="square" lIns="0" tIns="0" rIns="0" bIns="0" rtlCol="0">
+                          <ns5:prstTxWarp prst="textNoShape">
+                            <ns5:avLst/>
+                          </ns5:prstTxWarp>
+                          <ns5:noAutofit/>
+                        </ns9:bodyPr>
+                      </ns9:wsp>
+                    </ns6:wgp>
+                  </ns5:graphicData>
+                </ns5:graphic>
+              </ns3:anchor>
             </w:drawing>
-          </mc:Choice>
-          <mc:Fallback>
+          </ns1:Choice>
+          <ns1:Fallback>
             <w:pict>
-              <v:group w14:anchorId="439EBAEE" id="Group 1" o:spid="_x0000_s1026" style="position:absolute;margin-left:0;margin-top:777.35pt;width:454.65pt;height:64.95pt;z-index:15728640;mso-wrap-distance-left:0;mso-wrap-distance-right:0;mso-position-horizontal-relative:page;mso-position-vertical-relative:page" coordsize="57740,8248" o:gfxdata="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">
-                <v:shape id="Graphic 2" o:spid="_x0000_s1027" style="position:absolute;left:30573;top:3472;width:27171;height:4775;visibility:visible;mso-wrap-style:square;v-text-anchor:top" coordsize="2717165,477520" o:gfxdata="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" path="m1358395,l2716741,477170,,477170,1358395,xe" fillcolor="#d9d9d9" stroked="f">
-                  <v:path arrowok="t"/>
-                </v:shape>
-                <v:shape id="Graphic 3" o:spid="_x0000_s1028" style="position:absolute;left:15367;top:2150;width:34696;height:6096;visibility:visible;mso-wrap-style:square;v-text-anchor:top" coordsize="3469640,609600" o:gfxdata="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" path="m1734539,l3469085,609310,,609310,1734539,xe" fillcolor="#a6a6a6" stroked="f">
-                  <v:path arrowok="t"/>
-                </v:shape>
-                <v:shape id="Graphic 4" o:spid="_x0000_s1029" style="position:absolute;top:1;width:40855;height:8248;visibility:visible;mso-wrap-style:square;v-text-anchor:top" coordsize="4085590,824865" o:gfxdata="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" path="m1739055,l4085541,824276,,824276,,610910,1739055,xe" fillcolor="#37b5ff" stroked="f">
-                  <v:path arrowok="t"/>
-                </v:shape>
-                <v:shape id="Graphic 5" o:spid="_x0000_s1030" style="position:absolute;width:23653;height:8248;visibility:visible;mso-wrap-style:square;v-text-anchor:top" coordsize="2365375,824865" o:gfxdata="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" path="m361847,l2365154,824390,,824390,,148912,361847,xe" fillcolor="#202932" stroked="f">
-                  <v:path arrowok="t"/>
-                </v:shape>
-                <w10:wrap anchorx="page" anchory="page"/>
-              </v:group>
+              <ns10:group ns2:anchorId="439EBAEE" id="Group 1" ns11:spid="_x0000_s1026" style="position:absolute;margin-left:0;margin-top:777.35pt;width:454.65pt;height:64.95pt;z-index:15728640;mso-wrap-distance-left:0;mso-wrap-distance-right:0;mso-position-horizontal-relative:page;mso-position-vertical-relative:page" coordsize="57740,8248" ns11:gfxdata="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">
+                <ns10:shape id="Graphic 2" ns11:spid="_x0000_s1027" style="position:absolute;left:30573;top:3472;width:27171;height:4775;visibility:visible;mso-wrap-style:square;v-text-anchor:top" coordsize="2717165,477520" ns11:gfxdata="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" path="m1358395,l2716741,477170,,477170,1358395,xe" fillcolor="#d9d9d9" stroked="f">
+                  <ns10:path arrowok="t"/>
+                </ns10:shape>
+                <ns10:shape id="Graphic 3" ns11:spid="_x0000_s1028" style="position:absolute;left:15367;top:2150;width:34696;height:6096;visibility:visible;mso-wrap-style:square;v-text-anchor:top" coordsize="3469640,609600" ns11:gfxdata="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" path="m1734539,l3469085,609310,,609310,1734539,xe" fillcolor="#a6a6a6" stroked="f">
+                  <ns10:path arrowok="t"/>
+                </ns10:shape>
+                <ns10:shape id="Graphic 4" ns11:spid="_x0000_s1029" style="position:absolute;top:1;width:40855;height:8248;visibility:visible;mso-wrap-style:square;v-text-anchor:top" coordsize="4085590,824865" ns11:gfxdata="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" path="m1739055,l4085541,824276,,824276,,610910,1739055,xe" fillcolor="#37b5ff" stroked="f">
+                  <ns10:path arrowok="t"/>
+                </ns10:shape>
+                <ns10:shape id="Graphic 5" ns11:spid="_x0000_s1030" style="position:absolute;width:23653;height:8248;visibility:visible;mso-wrap-style:square;v-text-anchor:top" coordsize="2365375,824865" ns11:gfxdata="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" path="m361847,l2365154,824390,,824390,,148912,361847,xe" fillcolor="#202932" stroked="f">
+                  <ns10:path arrowok="t"/>
+                </ns10:shape>
+                <ns12:wrap anchorx="page" anchory="page"/>
+              </ns10:group>
             </w:pict>
-          </mc:Fallback>
-        </mc:AlternateContent>
+          </ns1:Fallback>
+        </ns1:AlternateContent>
       </w:r>
     </w:p>
-    <w:p>
+    <w:p ns2:paraId="34217324" ns2:textId="77777777">
       <w:pPr>
         <w:pStyle w:val="BodyText"/>
         <w:rPr>
@@ -992,7 +992,7 @@
         </w:rPr>
       </w:pPr>
     </w:p>
-    <w:p>
+    <w:p ns2:paraId="024B0CAA" ns2:textId="77777777">
       <w:pPr>
         <w:pStyle w:val="BodyText"/>
         <w:rPr>
@@ -1000,7 +1000,7 @@
         </w:rPr>
       </w:pPr>
     </w:p>
-    <w:p>
+    <w:p ns2:paraId="14318E68" ns2:textId="77777777">
       <w:pPr>
         <w:pStyle w:val="BodyText"/>
         <w:rPr>
@@ -1008,7 +1008,7 @@
         </w:rPr>
       </w:pPr>
     </w:p>
-    <w:p>
+    <w:p ns2:paraId="4C30EB8C" ns2:textId="550BD0C4">
       <w:pPr>
         <w:pStyle w:val="BodyText"/>
         <w:rPr>
@@ -1016,7 +1016,7 @@
         </w:rPr>
       </w:pPr>
     </w:p>
-    <w:p>
+    <w:p ns2:paraId="0BC93A72" ns2:textId="15F3956B">
       <w:pPr>
         <w:pStyle w:val="BodyText"/>
         <w:rPr>
@@ -1024,7 +1024,7 @@
         </w:rPr>
       </w:pPr>
     </w:p>
-    <w:p>
+    <w:p ns2:paraId="41D3E00F" ns2:textId="0622AAEF">
       <w:pPr>
         <w:pStyle w:val="BodyText"/>
         <w:rPr>
@@ -1032,7 +1032,7 @@
         </w:rPr>
       </w:pPr>
     </w:p>
-    <w:p>
+    <w:p ns2:paraId="78478593" ns2:textId="67A74E63">
       <w:pPr>
         <w:pStyle w:val="BodyText"/>
         <w:rPr>
@@ -1040,7 +1040,7 @@
         </w:rPr>
       </w:pPr>
     </w:p>
-    <w:p>
+    <w:p ns2:paraId="6ADC4858" ns2:textId="6B740065">
       <w:pPr>
         <w:pStyle w:val="BodyText"/>
         <w:rPr>
@@ -1048,7 +1048,7 @@
         </w:rPr>
       </w:pPr>
     </w:p>
-    <w:p>
+    <w:p ns2:paraId="1FD04032" ns2:textId="77777777">
       <w:pPr>
         <w:pStyle w:val="BodyText"/>
         <w:rPr>
@@ -1056,7 +1056,7 @@
         </w:rPr>
       </w:pPr>
     </w:p>
-    <w:p>
+    <w:p ns2:paraId="133B8B1E" ns2:textId="426CB692">
       <w:pPr>
         <w:pStyle w:val="BodyText"/>
         <w:rPr>
@@ -1064,7 +1064,7 @@
         </w:rPr>
       </w:pPr>
     </w:p>
-    <w:p>
+    <w:p ns2:paraId="2E0B0A18" ns2:textId="61CEC114">
       <w:pPr>
         <w:rPr>
           <w:rFonts w:ascii="Avenir Next LT Pro Light" w:hAnsi="Avenir Next LT Pro Light"/>
@@ -1091,7 +1091,7 @@
         <w:t>PROFORMA INVOICE</w:t>
       </w:r>
     </w:p>
-    <w:p>
+    <w:p ns2:paraId="3C33D4F1" ns2:textId="0A1F454A">
       <w:pPr>
         <w:rPr>
           <w:rFonts w:ascii="Avenir Next LT Pro Light" w:hAnsi="Avenir Next LT Pro Light"/>
@@ -1113,7 +1113,7 @@
         <w:gridCol w:w="1927"/>
         <w:gridCol w:w="2892"/>
       </w:tblGrid>
-      <w:tr>
+      <w:tr ns2:paraId="2C63C8CF" ns2:textId="77777777">
         <w:trPr>
           <w:trHeight w:val="372"/>
         </w:trPr>
@@ -1122,7 +1122,7 @@
             <w:tcW w:w="4253" w:type="dxa"/>
             <w:vMerge w:val="restart"/>
           </w:tcPr>
-          <w:p>
+          <w:p ns2:paraId="422A9490" ns2:textId="6B064958">
             <w:pPr>
               <w:rPr>
                 <w:rFonts w:ascii="Avenir Next LT Pro Light" w:hAnsi="Avenir Next LT Pro Light"/>
@@ -1175,7 +1175,7 @@
               <w:t>.</w:t>
             </w:r>
           </w:p>
-          <w:p>
+          <w:p ns2:paraId="788F141B" ns2:textId="769238D1">
             <w:pPr>
               <w:rPr>
                 <w:rFonts w:ascii="Avenir Next LT Pro Light" w:hAnsi="Avenir Next LT Pro Light"/>
@@ -1190,7 +1190,7 @@
             <w:tcW w:w="4819" w:type="dxa"/>
             <w:gridSpan w:val="2"/>
           </w:tcPr>
-          <w:p>
+          <w:p ns2:paraId="24034466" ns2:textId="242F7C8D">
             <w:pPr>
               <w:rPr>
                 <w:rFonts w:ascii="Avenir Next LT Pro Light" w:hAnsi="Avenir Next LT Pro Light"/>
@@ -1273,7 +1273,7 @@
           </w:p>
         </w:tc>
       </w:tr>
-      <w:tr>
+      <w:tr ns2:paraId="22B76FF4" ns2:textId="77777777">
         <w:trPr>
           <w:trHeight w:val="372"/>
         </w:trPr>
@@ -1282,7 +1282,7 @@
             <w:tcW w:w="4253" w:type="dxa"/>
             <w:vMerge/>
           </w:tcPr>
-          <w:p>
+          <w:p ns2:paraId="0B1B792E" ns2:textId="77777777">
             <w:pPr>
               <w:rPr>
                 <w:rFonts w:ascii="Avenir Next LT Pro Light" w:hAnsi="Avenir Next LT Pro Light"/>
@@ -1297,7 +1297,7 @@
             <w:tcW w:w="4819" w:type="dxa"/>
             <w:gridSpan w:val="2"/>
           </w:tcPr>
-          <w:p>
+          <w:p ns2:paraId="3804943B" ns2:textId="5BF94479">
             <w:pPr>
               <w:rPr>
                 <w:rFonts w:ascii="Avenir Next LT Pro Light" w:hAnsi="Avenir Next LT Pro Light"/>
@@ -1330,7 +1330,7 @@
           </w:p>
         </w:tc>
       </w:tr>
-      <w:tr>
+      <w:tr ns2:paraId="5DE8F7B8" ns2:textId="77777777">
         <w:trPr>
           <w:trHeight w:val="408"/>
         </w:trPr>
@@ -1339,7 +1339,7 @@
             <w:tcW w:w="4253" w:type="dxa"/>
             <w:vMerge/>
           </w:tcPr>
-          <w:p>
+          <w:p ns2:paraId="724EB948" ns2:textId="77777777">
             <w:pPr>
               <w:rPr>
                 <w:rFonts w:ascii="Avenir Next LT Pro Light" w:hAnsi="Avenir Next LT Pro Light"/>
@@ -1354,7 +1354,7 @@
             <w:tcW w:w="4819" w:type="dxa"/>
             <w:gridSpan w:val="2"/>
           </w:tcPr>
-          <w:p>
+          <w:p ns2:paraId="5126F099" ns2:textId="77777777">
             <w:pPr>
               <w:rPr>
                 <w:rFonts w:ascii="Avenir Next LT Pro Light" w:hAnsi="Avenir Next LT Pro Light"/>
@@ -1385,7 +1385,7 @@
           </w:p>
         </w:tc>
       </w:tr>
-      <w:tr>
+      <w:tr ns2:paraId="383BB185" ns2:textId="77777777">
         <w:trPr>
           <w:trHeight w:val="432"/>
         </w:trPr>
@@ -1394,7 +1394,7 @@
             <w:tcW w:w="4253" w:type="dxa"/>
             <w:vMerge w:val="restart"/>
           </w:tcPr>
-          <w:p>
+          <w:p ns2:paraId="4D743B63" ns2:textId="17EB8532">
             <w:pPr>
               <w:rPr>
                 <w:rFonts w:ascii="Avenir Next LT Pro Light" w:hAnsi="Avenir Next LT Pro Light"/>
@@ -1470,7 +1470,7 @@
             <w:tcW w:w="4819" w:type="dxa"/>
             <w:gridSpan w:val="2"/>
           </w:tcPr>
-          <w:p>
+          <w:p ns2:paraId="7F17343B" ns2:textId="53A5F376">
             <w:pPr>
               <w:rPr>
                 <w:rFonts w:ascii="Avenir Next LT Pro Light" w:hAnsi="Avenir Next LT Pro Light"/>
@@ -1509,7 +1509,7 @@
           </w:p>
         </w:tc>
       </w:tr>
-      <w:tr>
+      <w:tr ns2:paraId="2809F269" ns2:textId="77777777">
         <w:trPr>
           <w:trHeight w:val="372"/>
         </w:trPr>
@@ -1518,7 +1518,7 @@
             <w:tcW w:w="4253" w:type="dxa"/>
             <w:vMerge/>
           </w:tcPr>
-          <w:p>
+          <w:p ns2:paraId="65161F58" ns2:textId="77777777">
             <w:pPr>
               <w:rPr>
                 <w:rFonts w:ascii="Avenir Next LT Pro Light" w:hAnsi="Avenir Next LT Pro Light"/>
@@ -1533,7 +1533,7 @@
             <w:tcW w:w="4819" w:type="dxa"/>
             <w:gridSpan w:val="2"/>
           </w:tcPr>
-          <w:p>
+          <w:p ns2:paraId="1CBD5F9E" ns2:textId="77777777">
             <w:pPr>
               <w:rPr>
                 <w:rFonts w:ascii="Avenir Next LT Pro Light" w:hAnsi="Avenir Next LT Pro Light"/>
@@ -1564,7 +1564,7 @@
           </w:p>
         </w:tc>
       </w:tr>
-      <w:tr>
+      <w:tr ns2:paraId="29DA7650" ns2:textId="77777777">
         <w:trPr>
           <w:trHeight w:val="1325"/>
         </w:trPr>
@@ -1573,7 +1573,7 @@
             <w:tcW w:w="4253" w:type="dxa"/>
             <w:vMerge/>
           </w:tcPr>
-          <w:p>
+          <w:p ns2:paraId="20A580F6" ns2:textId="77777777">
             <w:pPr>
               <w:rPr>
                 <w:rFonts w:ascii="Avenir Next LT Pro Light" w:hAnsi="Avenir Next LT Pro Light"/>
@@ -1588,7 +1588,7 @@
             <w:tcW w:w="4819" w:type="dxa"/>
             <w:gridSpan w:val="2"/>
           </w:tcPr>
-          <w:p>
+          <w:p ns2:paraId="0851168B" ns2:textId="7F804C40">
             <w:pPr>
               <w:rPr>
                 <w:rFonts w:ascii="Avenir Next LT Pro Light" w:hAnsi="Avenir Next LT Pro Light"/>
@@ -1619,7 +1619,7 @@
           </w:p>
         </w:tc>
       </w:tr>
-      <w:tr>
+      <w:tr ns2:paraId="59708D47" ns2:textId="77777777">
         <w:trPr>
           <w:trHeight w:val="396"/>
         </w:trPr>
@@ -1628,7 +1628,7 @@
             <w:tcW w:w="4253" w:type="dxa"/>
             <w:vMerge w:val="restart"/>
           </w:tcPr>
-          <w:p>
+          <w:p ns2:paraId="4709E716" ns2:textId="63AEC0E2">
             <w:pPr>
               <w:rPr>
                 <w:rFonts w:ascii="Avenir Next LT Pro Light" w:hAnsi="Avenir Next LT Pro Light"/>
@@ -1653,7 +1653,7 @@
             <w:tcW w:w="4819" w:type="dxa"/>
             <w:gridSpan w:val="2"/>
           </w:tcPr>
-          <w:p>
+          <w:p ns2:paraId="61F309DC" ns2:textId="6B653E35">
             <w:pPr>
               <w:rPr>
                 <w:rFonts w:ascii="Avenir Next LT Pro Light" w:hAnsi="Avenir Next LT Pro Light"/>
@@ -1689,7 +1689,7 @@
               <w:t>PAYMENT ALLOWED</w:t>
             </w:r>
           </w:p>
-          <w:p>
+          <w:p ns2:paraId="43CE3914" ns2:textId="77777777">
             <w:pPr>
               <w:rPr>
                 <w:rFonts w:ascii="Avenir Next LT Pro Light" w:hAnsi="Avenir Next LT Pro Light"/>
@@ -1702,7 +1702,7 @@
           </w:p>
         </w:tc>
       </w:tr>
-      <w:tr>
+      <w:tr ns2:paraId="445EA7E6" ns2:textId="77777777">
         <w:trPr>
           <w:trHeight w:val="336"/>
         </w:trPr>
@@ -1711,7 +1711,7 @@
             <w:tcW w:w="4253" w:type="dxa"/>
             <w:vMerge/>
           </w:tcPr>
-          <w:p>
+          <w:p ns2:paraId="4DE8D4E7" ns2:textId="77777777">
             <w:pPr>
               <w:rPr>
                 <w:rFonts w:ascii="Avenir Next LT Pro Light" w:hAnsi="Avenir Next LT Pro Light"/>
@@ -1726,7 +1726,7 @@
             <w:tcW w:w="4819" w:type="dxa"/>
             <w:gridSpan w:val="2"/>
           </w:tcPr>
-          <w:p>
+          <w:p ns2:paraId="783C8246" ns2:textId="77777777">
             <w:pPr>
               <w:rPr>
                 <w:rFonts w:ascii="Avenir Next LT Pro Light" w:hAnsi="Avenir Next LT Pro Light"/>
@@ -1749,7 +1749,7 @@
           </w:p>
         </w:tc>
       </w:tr>
-      <w:tr>
+      <w:tr ns2:paraId="16260CAC" ns2:textId="77777777">
         <w:trPr>
           <w:trHeight w:val="420"/>
         </w:trPr>
@@ -1758,7 +1758,7 @@
             <w:tcW w:w="4253" w:type="dxa"/>
             <w:vMerge/>
           </w:tcPr>
-          <w:p>
+          <w:p ns2:paraId="7E5BEEC1" ns2:textId="77777777">
             <w:pPr>
               <w:rPr>
                 <w:rFonts w:ascii="Avenir Next LT Pro Light" w:hAnsi="Avenir Next LT Pro Light"/>
@@ -1772,7 +1772,7 @@
           <w:tcPr>
             <w:tcW w:w="1927" w:type="dxa"/>
           </w:tcPr>
-          <w:p>
+          <w:p ns2:paraId="27E357E7" ns2:textId="77777777">
             <w:pPr>
               <w:rPr>
                 <w:rFonts w:ascii="Avenir Next LT Pro Light" w:hAnsi="Avenir Next LT Pro Light"/>
@@ -1798,7 +1798,7 @@
           <w:tcPr>
             <w:tcW w:w="2892" w:type="dxa"/>
           </w:tcPr>
-          <w:p>
+          <w:p ns2:paraId="57B00113" ns2:textId="77777777">
             <w:pPr>
               <w:rPr>
                 <w:rFonts w:ascii="Avenir Next LT Pro Light" w:hAnsi="Avenir Next LT Pro Light"/>
@@ -1838,7 +1838,7 @@
         <w:gridCol w:w="1225"/>
         <w:gridCol w:w="1760"/>
       </w:tblGrid>
-      <w:tr>
+      <w:tr ns2:paraId="0D702D35" ns2:textId="77777777">
         <w:trPr>
           <w:trHeight w:val="396"/>
         </w:trPr>
@@ -1846,7 +1846,7 @@
           <w:tcPr>
             <w:tcW w:w="1284" w:type="dxa"/>
           </w:tcPr>
-          <w:p>
+          <w:p ns2:paraId="4CC0E2FF" ns2:textId="77777777">
             <w:pPr>
               <w:jc w:val="center"/>
               <w:rPr>
@@ -1873,7 +1873,7 @@
           <w:tcPr>
             <w:tcW w:w="2222" w:type="dxa"/>
           </w:tcPr>
-          <w:p>
+          <w:p ns2:paraId="1ED1398A" ns2:textId="77777777">
             <w:pPr>
               <w:jc w:val="center"/>
               <w:rPr>
@@ -1900,7 +1900,7 @@
           <w:tcPr>
             <w:tcW w:w="1069" w:type="dxa"/>
           </w:tcPr>
-          <w:p>
+          <w:p ns2:paraId="5B9921FF" ns2:textId="77777777">
             <w:pPr>
               <w:jc w:val="center"/>
               <w:rPr>
@@ -1928,7 +1928,7 @@
             <w:tcW w:w="1500" w:type="dxa"/>
             <w:gridSpan w:val="2"/>
           </w:tcPr>
-          <w:p>
+          <w:p ns2:paraId="1CBA1CB0" ns2:textId="77777777">
             <w:pPr>
               <w:jc w:val="center"/>
               <w:rPr>
@@ -1955,7 +1955,7 @@
           <w:tcPr>
             <w:tcW w:w="1227" w:type="dxa"/>
           </w:tcPr>
-          <w:p>
+          <w:p ns2:paraId="2AEB58BE" ns2:textId="77777777">
             <w:pPr>
               <w:jc w:val="center"/>
               <w:rPr>
@@ -1977,7 +1977,7 @@
               <w:t>RATE</w:t>
             </w:r>
           </w:p>
-          <w:p>
+          <w:p ns2:paraId="21B82B78" ns2:textId="77777777">
             <w:pPr>
               <w:jc w:val="center"/>
               <w:rPr>
@@ -2004,7 +2004,7 @@
           <w:tcPr>
             <w:tcW w:w="1765" w:type="dxa"/>
           </w:tcPr>
-          <w:p>
+          <w:p ns2:paraId="31686825" ns2:textId="77777777">
             <w:pPr>
               <w:jc w:val="center"/>
               <w:rPr>
@@ -2028,7 +2028,7 @@
           </w:p>
         </w:tc>
       </w:tr>
-      <w:tr>
+      <w:tr ns2:paraId="6F6A004B" ns2:textId="77777777">
         <w:trPr>
           <w:trHeight w:val="1294"/>
         </w:trPr>
@@ -2036,7 +2036,7 @@
           <w:tcPr>
             <w:tcW w:w="1284" w:type="dxa"/>
           </w:tcPr>
-          <w:p>
+          <w:p ns2:paraId="46A79E95" ns2:textId="77777777">
             <w:pPr>
               <w:rPr>
                 <w:rFonts w:ascii="Avenir Next LT Pro Light" w:hAnsi="Avenir Next LT Pro Light"/>
@@ -2055,7 +2055,7 @@
               <w:br/>
             </w:r>
           </w:p>
-          <w:p>
+          <w:p ns2:paraId="238314F6" ns2:textId="799AE748">
             <w:pPr>
               <w:rPr>
                 <w:rFonts w:ascii="Avenir Next LT Pro Light" w:hAnsi="Avenir Next LT Pro Light"/>
@@ -2069,7 +2069,7 @@
               <w:t>76020010</w:t>
             </w:r>
           </w:p>
-          <w:p>
+          <w:p ns2:paraId="76C7D883" ns2:textId="77777777">
             <w:pPr>
               <w:rPr>
                 <w:rFonts w:ascii="Avenir Next LT Pro Light" w:hAnsi="Avenir Next LT Pro Light"/>
@@ -2081,7 +2081,7 @@
           <w:tcPr>
             <w:tcW w:w="2222" w:type="dxa"/>
           </w:tcPr>
-          <w:p>
+          <w:p ns2:paraId="19D03A06" ns2:textId="3318B82D">
             <w:pPr>
               <w:rPr>
                 <w:rFonts w:ascii="Avenir Next LT Pro Light" w:hAnsi="Avenir Next LT Pro Light"/>
@@ -2117,7 +2117,7 @@
               <w:t xml:space="preserve"> </w:t>
             </w:r>
           </w:p>
-          <w:p>
+          <w:p ns2:paraId="6BCA0DCD" ns2:textId="26FE14CF">
             <w:pPr>
               <w:rPr>
                 <w:rFonts w:ascii="Avenir Next LT Pro Light" w:hAnsi="Avenir Next LT Pro Light"/>
@@ -2129,7 +2129,7 @@
           <w:tcPr>
             <w:tcW w:w="1069" w:type="dxa"/>
           </w:tcPr>
-          <w:p>
+          <w:p ns2:paraId="4180672F" ns2:textId="4BB10C7B">
             <w:pPr>
               <w:rPr>
                 <w:rFonts w:ascii="Avenir Next LT Pro Light" w:hAnsi="Avenir Next LT Pro Light"/>
@@ -2148,7 +2148,7 @@
             <w:tcW w:w="1500" w:type="dxa"/>
             <w:gridSpan w:val="2"/>
           </w:tcPr>
-          <w:p>
+          <w:p ns2:paraId="76035DB2" ns2:textId="257ED7BB">
             <w:pPr>
               <w:rPr>
                 <w:rFonts w:ascii="Avenir Next LT Pro Light" w:hAnsi="Avenir Next LT Pro Light"/>
@@ -2178,7 +2178,7 @@
           <w:tcPr>
             <w:tcW w:w="1227" w:type="dxa"/>
           </w:tcPr>
-          <w:p>
+          <w:p ns2:paraId="7A2E7DE1" ns2:textId="5942C6FC">
             <w:pPr>
               <w:rPr>
                 <w:rFonts w:ascii="Avenir Next LT Pro Light" w:hAnsi="Avenir Next LT Pro Light"/>
@@ -2208,7 +2208,7 @@
           <w:tcPr>
             <w:tcW w:w="1765" w:type="dxa"/>
           </w:tcPr>
-          <w:p>
+          <w:p ns2:paraId="64A029A1" ns2:textId="2E36D93C">
             <w:pPr>
               <w:rPr>
                 <w:rFonts w:ascii="Avenir Next LT Pro Light" w:hAnsi="Avenir Next LT Pro Light"/>
@@ -2235,7 +2235,7 @@
           </w:p>
         </w:tc>
       </w:tr>
-      <w:tr>
+      <w:tr ns2:paraId="5B482746" ns2:textId="77777777">
         <w:trPr>
           <w:trHeight w:val="297"/>
         </w:trPr>
@@ -2243,7 +2243,7 @@
           <w:tcPr>
             <w:tcW w:w="1284" w:type="dxa"/>
           </w:tcPr>
-          <w:p>
+          <w:p ns2:paraId="509A3249" ns2:textId="77777777">
             <w:pPr>
               <w:rPr>
                 <w:rFonts w:ascii="Avenir Next LT Pro Light" w:hAnsi="Avenir Next LT Pro Light"/>
@@ -2265,7 +2265,7 @@
           <w:tcPr>
             <w:tcW w:w="2222" w:type="dxa"/>
           </w:tcPr>
-          <w:p>
+          <w:p ns2:paraId="4687E9DE" ns2:textId="77777777">
             <w:pPr>
               <w:rPr>
                 <w:rFonts w:ascii="Avenir Next LT Pro Light" w:hAnsi="Avenir Next LT Pro Light"/>
@@ -2277,7 +2277,7 @@
           <w:tcPr>
             <w:tcW w:w="1069" w:type="dxa"/>
           </w:tcPr>
-          <w:p>
+          <w:p ns2:paraId="6723D133" ns2:textId="77777777">
             <w:pPr>
               <w:rPr>
                 <w:rFonts w:ascii="Avenir Next LT Pro Light" w:hAnsi="Avenir Next LT Pro Light"/>
@@ -2290,7 +2290,7 @@
             <w:tcW w:w="1500" w:type="dxa"/>
             <w:gridSpan w:val="2"/>
           </w:tcPr>
-          <w:p>
+          <w:p ns2:paraId="641D6C6A" ns2:textId="00F3516F">
             <w:pPr>
               <w:rPr>
                 <w:rFonts w:ascii="Avenir Next LT Pro Light" w:hAnsi="Avenir Next LT Pro Light"/>
@@ -2336,7 +2336,7 @@
           <w:tcPr>
             <w:tcW w:w="1227" w:type="dxa"/>
           </w:tcPr>
-          <w:p>
+          <w:p ns2:paraId="57D50502" ns2:textId="77777777">
             <w:pPr>
               <w:rPr>
                 <w:rFonts w:ascii="Avenir Next LT Pro Light" w:hAnsi="Avenir Next LT Pro Light"/>
@@ -2354,7 +2354,7 @@
               <w:bottom w:val="nil"/>
             </w:tcBorders>
           </w:tcPr>
-          <w:p>
+          <w:p ns2:paraId="222E0A26" ns2:textId="3264CE1C">
             <w:pPr>
               <w:rPr>
                 <w:rFonts w:ascii="Avenir Next LT Pro Light" w:hAnsi="Avenir Next LT Pro Light"/>
@@ -2429,7 +2429,7 @@
           </w:p>
         </w:tc>
       </w:tr>
-      <w:tr>
+      <w:tr ns2:paraId="74ED0BB7" ns2:textId="77777777">
         <w:trPr>
           <w:trHeight w:val="374"/>
         </w:trPr>
@@ -2438,7 +2438,7 @@
             <w:tcW w:w="9067" w:type="dxa"/>
             <w:gridSpan w:val="7"/>
           </w:tcPr>
-          <w:p>
+          <w:p ns2:paraId="7A178F9A" ns2:textId="009213DA">
             <w:pPr>
               <w:rPr>
                 <w:rFonts w:ascii="Avenir Next LT Pro Light" w:hAnsi="Avenir Next LT Pro Light"/>
@@ -2487,7 +2487,7 @@
           </w:p>
         </w:tc>
       </w:tr>
-      <w:tr>
+      <w:tr ns2:paraId="7C57731D" ns2:textId="77777777">
         <w:trPr>
           <w:trHeight w:val="199"/>
         </w:trPr>
@@ -2500,7 +2500,7 @@
               <w:right w:val="nil"/>
             </w:tcBorders>
           </w:tcPr>
-          <w:p>
+          <w:p ns2:paraId="44E76696" ns2:textId="77777777">
             <w:pPr>
               <w:rPr>
                 <w:rFonts w:ascii="Avenir Next LT Pro Light" w:hAnsi="Avenir Next LT Pro Light"/>
@@ -2509,7 +2509,7 @@
           </w:p>
         </w:tc>
       </w:tr>
-      <w:tr>
+      <w:tr ns2:paraId="738F7C6B" ns2:textId="02B9EFDC">
         <w:tblPrEx>
           <w:tblLook w:val="0000" w:firstRow="0" w:lastRow="0" w:firstColumn="0" w:lastColumn="0" w:noHBand="0" w:noVBand="0"/>
         </w:tblPrEx>
@@ -2521,7 +2521,7 @@
             <w:tcW w:w="4848" w:type="dxa"/>
             <w:gridSpan w:val="4"/>
           </w:tcPr>
-          <w:p>
+          <w:p ns2:paraId="7E112A44" ns2:textId="3E964D8B">
             <w:pPr>
               <w:jc w:val="center"/>
               <w:rPr>
@@ -2545,7 +2545,7 @@
             <w:tcW w:w="4219" w:type="dxa"/>
             <w:gridSpan w:val="3"/>
           </w:tcPr>
-          <w:p>
+          <w:p ns2:paraId="32338644" ns2:textId="1A721A81">
             <w:pPr>
               <w:jc w:val="center"/>
               <w:rPr>
@@ -2565,7 +2565,7 @@
           </w:p>
         </w:tc>
       </w:tr>
-      <w:tr>
+      <w:tr ns2:paraId="371F1F09" ns2:textId="77777777">
         <w:tblPrEx>
           <w:tblLook w:val="0000" w:firstRow="0" w:lastRow="0" w:firstColumn="0" w:lastColumn="0" w:noHBand="0" w:noVBand="0"/>
         </w:tblPrEx>
@@ -2580,7 +2580,7 @@
               <w:bottom w:val="single" w:sz="4" w:space="0" w:color="auto"/>
             </w:tcBorders>
           </w:tcPr>
-          <w:p>
+          <w:p ns2:paraId="62A50FAD" ns2:textId="5F1B5690">
             <w:pPr>
               <w:rPr>
                 <w:rFonts w:ascii="Avenir Next LT Pro Light" w:hAnsi="Avenir Next LT Pro Light"/>
@@ -2776,7 +2776,7 @@
               <w:bottom w:val="single" w:sz="4" w:space="0" w:color="auto"/>
             </w:tcBorders>
           </w:tcPr>
-          <w:p>
+          <w:p ns2:paraId="17FF45A2" ns2:textId="5ADD3E30">
             <w:pPr>
               <w:rPr>
                 <w:rFonts w:ascii="Avenir Next LT Pro Light" w:hAnsi="Avenir Next LT Pro Light"/>
@@ -2790,65 +2790,65 @@
                 <w:noProof/>
               </w:rPr>
               <w:drawing>
-                <wp:anchor distT="0" distB="0" distL="114300" distR="114300" simplePos="0" relativeHeight="487532544" behindDoc="0" locked="0" layoutInCell="1" allowOverlap="1" wp14:anchorId="7903BA5C" wp14:editId="416193F3">
-                  <wp:simplePos x="0" y="0"/>
-                  <wp:positionH relativeFrom="margin">
-                    <wp:posOffset>686526</wp:posOffset>
-                  </wp:positionH>
-                  <wp:positionV relativeFrom="paragraph">
-                    <wp:posOffset>123825</wp:posOffset>
-                  </wp:positionV>
-                  <wp:extent cx="1240972" cy="1185612"/>
-                  <wp:effectExtent l="0" t="0" r="0" b="0"/>
-                  <wp:wrapNone/>
-                  <wp:docPr id="492018297" name="Picture 10"/>
-                  <wp:cNvGraphicFramePr>
-                    <a:graphicFrameLocks xmlns:a="http://schemas.openxmlformats.org/drawingml/2006/main" noChangeAspect="1"/>
-                  </wp:cNvGraphicFramePr>
-                  <a:graphic xmlns:a="http://schemas.openxmlformats.org/drawingml/2006/main">
-                    <a:graphicData uri="http://schemas.openxmlformats.org/drawingml/2006/picture">
-                      <pic:pic xmlns:pic="http://schemas.openxmlformats.org/drawingml/2006/picture">
-                        <pic:nvPicPr>
-                          <pic:cNvPr id="492018297" name="Picture 492018297"/>
-                          <pic:cNvPicPr/>
-                        </pic:nvPicPr>
-                        <pic:blipFill>
-                          <a:blip r:embed="rId8" cstate="print">
-                            <a:extLst>
-                              <a:ext uri="{28A0092B-C50C-407E-A947-70E740481C1C}">
-                                <a14:useLocalDpi xmlns:a14="http://schemas.microsoft.com/office/drawing/2010/main" val="0"/>
-                              </a:ext>
-                            </a:extLst>
-                          </a:blip>
-                          <a:stretch>
-                            <a:fillRect/>
-                          </a:stretch>
-                        </pic:blipFill>
-                        <pic:spPr>
-                          <a:xfrm>
-                            <a:off x="0" y="0"/>
-                            <a:ext cx="1240972" cy="1185612"/>
-                          </a:xfrm>
-                          <a:prstGeom prst="rect">
-                            <a:avLst/>
-                          </a:prstGeom>
-                        </pic:spPr>
-                      </pic:pic>
-                    </a:graphicData>
-                  </a:graphic>
-                  <wp14:sizeRelH relativeFrom="margin">
-                    <wp14:pctWidth>0</wp14:pctWidth>
-                  </wp14:sizeRelH>
-                  <wp14:sizeRelV relativeFrom="margin">
-                    <wp14:pctHeight>0</wp14:pctHeight>
-                  </wp14:sizeRelV>
-                </wp:anchor>
+                <ns3:anchor distT="0" distB="0" distL="114300" distR="114300" simplePos="0" relativeHeight="487532544" behindDoc="0" locked="0" layoutInCell="1" allowOverlap="1" ns4:anchorId="7903BA5C" ns4:editId="416193F3">
+                  <ns3:simplePos x="0" y="0"/>
+                  <ns3:positionH relativeFrom="margin">
+                    <ns3:posOffset>686526</ns3:posOffset>
+                  </ns3:positionH>
+                  <ns3:positionV relativeFrom="paragraph">
+                    <ns3:posOffset>123825</ns3:posOffset>
+                  </ns3:positionV>
+                  <ns3:extent cx="1240972" cy="1185612"/>
+                  <ns3:effectExtent l="0" t="0" r="0" b="0"/>
+                  <ns3:wrapNone/>
+                  <ns3:docPr id="492018297" name="Picture 10"/>
+                  <ns3:cNvGraphicFramePr>
+                    <ns5:graphicFrameLocks noChangeAspect="1"/>
+                  </ns3:cNvGraphicFramePr>
+                  <ns5:graphic>
+                    <ns5:graphicData uri="http://schemas.openxmlformats.org/drawingml/2006/picture">
+                      <ns7:pic>
+                        <ns7:nvPicPr>
+                          <ns7:cNvPr id="492018297" name="Picture 492018297"/>
+                          <ns7:cNvPicPr/>
+                        </ns7:nvPicPr>
+                        <ns7:blipFill>
+                          <ns5:blip r:embed="rId8" cstate="print">
+                            <ns5:extLst>
+                              <ns5:ext uri="{28A0092B-C50C-407E-A947-70E740481C1C}">
+                                <ns13:useLocalDpi val="0"/>
+                              </ns5:ext>
+                            </ns5:extLst>
+                          </ns5:blip>
+                          <ns5:stretch>
+                            <ns5:fillRect/>
+                          </ns5:stretch>
+                        </ns7:blipFill>
+                        <ns7:spPr>
+                          <ns5:xfrm>
+                            <ns5:off x="0" y="0"/>
+                            <ns5:ext cx="1240972" cy="1185612"/>
+                          </ns5:xfrm>
+                          <ns5:prstGeom prst="rect">
+                            <ns5:avLst/>
+                          </ns5:prstGeom>
+                        </ns7:spPr>
+                      </ns7:pic>
+                    </ns5:graphicData>
+                  </ns5:graphic>
+                  <ns4:sizeRelH relativeFrom="margin">
+                    <ns4:pctWidth>0</ns4:pctWidth>
+                  </ns4:sizeRelH>
+                  <ns4:sizeRelV relativeFrom="margin">
+                    <ns4:pctHeight>0</ns4:pctHeight>
+                  </ns4:sizeRelV>
+                </ns3:anchor>
               </w:drawing>
             </w:r>
           </w:p>
         </w:tc>
       </w:tr>
-      <w:tr>
+      <w:tr ns2:paraId="6A943F12" ns2:textId="77777777">
         <w:tblPrEx>
           <w:tblLook w:val="0000" w:firstRow="0" w:lastRow="0" w:firstColumn="0" w:lastColumn="0" w:noHBand="0" w:noVBand="0"/>
         </w:tblPrEx>
@@ -2865,7 +2865,7 @@
               <w:right w:val="nil"/>
             </w:tcBorders>
           </w:tcPr>
-          <w:p>
+          <w:p ns2:paraId="3FF6652D" ns2:textId="77777777">
             <w:pPr>
               <w:rPr>
                 <w:rFonts w:ascii="Avenir Next LT Pro Light" w:hAnsi="Avenir Next LT Pro Light"/>
@@ -2876,7 +2876,7 @@
           </w:p>
         </w:tc>
       </w:tr>
-      <w:tr>
+      <w:tr ns2:paraId="61F89C52" ns2:textId="77777777">
         <w:tblPrEx>
           <w:tblLook w:val="0000" w:firstRow="0" w:lastRow="0" w:firstColumn="0" w:lastColumn="0" w:noHBand="0" w:noVBand="0"/>
         </w:tblPrEx>
@@ -2888,7 +2888,7 @@
             <w:tcW w:w="9067" w:type="dxa"/>
             <w:gridSpan w:val="7"/>
           </w:tcPr>
-          <w:p>
+          <w:p ns2:paraId="54447991" ns2:textId="77777777">
             <w:pPr>
               <w:rPr>
                 <w:rFonts w:ascii="Avenir Next LT Pro Light" w:hAnsi="Avenir Next LT Pro Light"/>
@@ -2916,7 +2916,7 @@
         </w:tc>
       </w:tr>
     </w:tbl>
-    <w:p>
+    <w:p ns2:paraId="45477D77" ns2:textId="1991DE2B">
       <w:pPr>
         <w:pStyle w:val="BodyText"/>
         <w:rPr>
@@ -2924,7 +2924,7 @@
         </w:rPr>
       </w:pPr>
     </w:p>
-    <w:p>
+    <w:p ns2:paraId="62A518D1" ns2:textId="0E8B496B">
       <w:pPr>
         <w:pStyle w:val="BodyText"/>
         <w:rPr>
@@ -2932,7 +2932,7 @@
         </w:rPr>
       </w:pPr>
     </w:p>
-    <w:p>
+    <w:p ns2:paraId="72B5FAEA" ns2:textId="21905376">
       <w:pPr>
         <w:pStyle w:val="BodyText"/>
         <w:rPr>
@@ -2940,7 +2940,7 @@
         </w:rPr>
       </w:pPr>
     </w:p>
-    <w:p>
+    <w:p ns2:paraId="4A67DFEA" ns2:textId="197A3983">
       <w:pPr>
         <w:pStyle w:val="BodyText"/>
         <w:rPr>
@@ -2948,7 +2948,7 @@
         </w:rPr>
       </w:pPr>
     </w:p>
-    <w:p>
+    <w:p ns2:paraId="0E05E60F" ns2:textId="77777777">
       <w:pPr>
         <w:pStyle w:val="BodyText"/>
         <w:rPr>
@@ -2956,7 +2956,7 @@
         </w:rPr>
       </w:pPr>
     </w:p>
-    <w:p>
+    <w:p ns2:paraId="13577CF5" ns2:textId="6102F816">
       <w:pPr>
         <w:pStyle w:val="BodyText"/>
         <w:rPr>
@@ -2964,7 +2964,7 @@
         </w:rPr>
       </w:pPr>
     </w:p>
-    <w:p>
+    <w:p ns2:paraId="1E617CA0" ns2:textId="10888061">
       <w:pPr>
         <w:pStyle w:val="BodyText"/>
         <w:rPr>
@@ -2972,7 +2972,7 @@
         </w:rPr>
       </w:pPr>
     </w:p>
-    <w:p>
+    <w:p ns2:paraId="1CF6D3C1" ns2:textId="5E8227CF">
       <w:pPr>
         <w:pStyle w:val="BodyText"/>
         <w:rPr>
@@ -2980,7 +2980,7 @@
         </w:rPr>
       </w:pPr>
     </w:p>
-    <w:p>
+    <w:p ns2:paraId="44264D7C" ns2:textId="689FC8EA">
       <w:pPr>
         <w:pStyle w:val="BodyText"/>
         <w:rPr>
@@ -2988,7 +2988,7 @@
         </w:rPr>
       </w:pPr>
     </w:p>
-    <w:p>
+    <w:p ns2:paraId="0C7754A2" ns2:textId="058A857E">
       <w:pPr>
         <w:pStyle w:val="BodyText"/>
         <w:rPr>
@@ -2996,7 +2996,7 @@
         </w:rPr>
       </w:pPr>
     </w:p>
-    <w:p>
+    <w:p ns2:paraId="58F6825F" ns2:textId="0987B673">
       <w:pPr>
         <w:pStyle w:val="BodyText"/>
         <w:tabs>
@@ -3013,7 +3013,7 @@
         <w:tab/>
       </w:r>
     </w:p>
-    <w:p>
+    <w:p ns2:paraId="03F46735" ns2:textId="77777777">
       <w:pPr>
         <w:pStyle w:val="BodyText"/>
         <w:rPr>
@@ -3021,7 +3021,7 @@
         </w:rPr>
       </w:pPr>
     </w:p>
-    <w:p>
+    <w:p ns2:paraId="522816EC" ns2:textId="77777777">
       <w:pPr>
         <w:pStyle w:val="BodyText"/>
         <w:rPr>
@@ -3029,7 +3029,7 @@
         </w:rPr>
       </w:pPr>
     </w:p>
-    <w:p>
+    <w:p ns2:paraId="67043E30" ns2:textId="77777777">
       <w:pPr>
         <w:pStyle w:val="BodyText"/>
         <w:rPr>
@@ -3037,7 +3037,7 @@
         </w:rPr>
       </w:pPr>
     </w:p>
-    <w:p>
+    <w:p ns2:paraId="28D2AB34" ns2:textId="77777777">
       <w:pPr>
         <w:pStyle w:val="BodyText"/>
         <w:rPr>
@@ -3045,7 +3045,7 @@
         </w:rPr>
       </w:pPr>
     </w:p>
-    <w:p>
+    <w:p ns2:paraId="34FEB5B8" ns2:textId="77777777">
       <w:pPr>
         <w:pStyle w:val="BodyText"/>
         <w:rPr>
@@ -3053,7 +3053,7 @@
         </w:rPr>
       </w:pPr>
     </w:p>
-    <w:p>
+    <w:p ns2:paraId="2A8E26CA" ns2:textId="77777777">
       <w:pPr>
         <w:pStyle w:val="BodyText"/>
         <w:rPr>
@@ -3061,7 +3061,7 @@
         </w:rPr>
       </w:pPr>
     </w:p>
-    <w:p>
+    <w:p ns2:paraId="2A72F025" ns2:textId="28B7B65B">
       <w:pPr>
         <w:pStyle w:val="BodyText"/>
         <w:rPr>
@@ -3069,7 +3069,7 @@
         </w:rPr>
       </w:pPr>
     </w:p>
-    <w:p>
+    <w:p ns2:paraId="16739057" ns2:textId="77777777">
       <w:pPr>
         <w:pStyle w:val="BodyText"/>
         <w:rPr>
@@ -3077,7 +3077,7 @@
         </w:rPr>
       </w:pPr>
     </w:p>
-    <w:p>
+    <w:p ns2:paraId="6A75055D" ns2:textId="77777777">
       <w:pPr>
         <w:pStyle w:val="BodyText"/>
         <w:rPr>
@@ -3085,7 +3085,7 @@
         </w:rPr>
       </w:pPr>
     </w:p>
-    <w:p>
+    <w:p ns2:paraId="265B9DA0" ns2:textId="77777777">
       <w:pPr>
         <w:pStyle w:val="BodyText"/>
         <w:rPr>
@@ -3093,7 +3093,7 @@
         </w:rPr>
       </w:pPr>
     </w:p>
-    <w:p>
+    <w:p ns2:paraId="23BAB8A0" ns2:textId="77777777">
       <w:pPr>
         <w:pStyle w:val="BodyText"/>
         <w:rPr>
@@ -3101,7 +3101,7 @@
         </w:rPr>
       </w:pPr>
     </w:p>
-    <w:p>
+    <w:p ns2:paraId="4D49A020" ns2:textId="79F920E9">
       <w:pPr>
         <w:pStyle w:val="BodyText"/>
         <w:rPr>
@@ -3109,7 +3109,7 @@
         </w:rPr>
       </w:pPr>
     </w:p>
-    <w:p>
+    <w:p ns2:paraId="1C90C8D7" ns2:textId="7214775F">
       <w:pPr>
         <w:pStyle w:val="BodyText"/>
         <w:rPr>
@@ -3117,7 +3117,7 @@
         </w:rPr>
       </w:pPr>
     </w:p>
-    <w:p>
+    <w:p ns2:paraId="79759214" ns2:textId="56C209E1">
       <w:pPr>
         <w:pStyle w:val="BodyText"/>
         <w:rPr>
@@ -3125,7 +3125,7 @@
         </w:rPr>
       </w:pPr>
     </w:p>
-    <w:p>
+    <w:p ns2:paraId="2E720F64" ns2:textId="4E2E4223">
       <w:pPr>
         <w:pStyle w:val="BodyText"/>
         <w:rPr>
@@ -3133,7 +3133,7 @@
         </w:rPr>
       </w:pPr>
     </w:p>
-    <w:p>
+    <w:p ns2:paraId="68C52832" ns2:textId="474FE85E">
       <w:pPr>
         <w:pStyle w:val="BodyText"/>
         <w:rPr>
@@ -3141,7 +3141,7 @@
         </w:rPr>
       </w:pPr>
     </w:p>
-    <w:p>
+    <w:p ns2:paraId="6EA40132" ns2:textId="2940C3D7">
       <w:pPr>
         <w:pStyle w:val="BodyText"/>
         <w:rPr>
@@ -3159,161 +3159,16 @@
         <w:ind w:left="142"/>
         <w:jc w:val="center"/>
       </w:pPr>
-      <w:r>
-        <w:rPr>
-          <w:noProof/>
-        </w:rPr>
-        <w:drawing>
-          <wp:anchor distT="0" distB="0" distL="0" distR="0" simplePos="0" relativeHeight="487531520" behindDoc="1" locked="0" layoutInCell="1" allowOverlap="1" wp14:anchorId="6359E2A2" wp14:editId="0A58530C">
-            <wp:simplePos x="0" y="0"/>
-            <wp:positionH relativeFrom="page">
-              <wp:posOffset>4492386</wp:posOffset>
-            </wp:positionH>
-            <wp:positionV relativeFrom="paragraph">
-              <wp:posOffset>-27029</wp:posOffset>
-            </wp:positionV>
-            <wp:extent cx="229939" cy="229939"/>
-            <wp:effectExtent l="0" t="0" r="0" b="0"/>
-            <wp:wrapNone/>
-            <wp:docPr id="14" name="Image 14"/>
-            <wp:cNvGraphicFramePr>
-              <a:graphicFrameLocks xmlns:a="http://schemas.openxmlformats.org/drawingml/2006/main"/>
-            </wp:cNvGraphicFramePr>
-            <a:graphic xmlns:a="http://schemas.openxmlformats.org/drawingml/2006/main">
-              <a:graphicData uri="http://schemas.openxmlformats.org/drawingml/2006/picture">
-                <pic:pic xmlns:pic="http://schemas.openxmlformats.org/drawingml/2006/picture">
-                  <pic:nvPicPr>
-                    <pic:cNvPr id="14" name="Image 14"/>
-                    <pic:cNvPicPr/>
-                  </pic:nvPicPr>
-                  <pic:blipFill>
-                    <a:blip r:embed="rId9" cstate="print"/>
-                    <a:stretch>
-                      <a:fillRect/>
-                    </a:stretch>
-                  </pic:blipFill>
-                  <pic:spPr>
-                    <a:xfrm>
-                      <a:off x="0" y="0"/>
-                      <a:ext cx="229939" cy="229939"/>
-                    </a:xfrm>
-                    <a:prstGeom prst="rect">
-                      <a:avLst/>
-                    </a:prstGeom>
-                  </pic:spPr>
-                </pic:pic>
-              </a:graphicData>
-            </a:graphic>
-          </wp:anchor>
-        </w:drawing>
-      </w:r>
-      <w:r>
-        <w:rPr>
-          <w:noProof/>
-        </w:rPr>
-        <w:drawing>
-          <wp:anchor distT="0" distB="0" distL="0" distR="0" simplePos="0" relativeHeight="15729664" behindDoc="0" locked="0" layoutInCell="1" allowOverlap="1" wp14:anchorId="79769FF0" wp14:editId="56E2BD50">
-            <wp:simplePos x="0" y="0"/>
-            <wp:positionH relativeFrom="page">
-              <wp:posOffset>1775231</wp:posOffset>
-            </wp:positionH>
-            <wp:positionV relativeFrom="paragraph">
-              <wp:posOffset>12266</wp:posOffset>
-            </wp:positionV>
-            <wp:extent cx="229850" cy="176807"/>
-            <wp:effectExtent l="0" t="0" r="0" b="0"/>
-            <wp:wrapNone/>
-            <wp:docPr id="15" name="Image 15"/>
-            <wp:cNvGraphicFramePr>
-              <a:graphicFrameLocks xmlns:a="http://schemas.openxmlformats.org/drawingml/2006/main"/>
-            </wp:cNvGraphicFramePr>
-            <a:graphic xmlns:a="http://schemas.openxmlformats.org/drawingml/2006/main">
-              <a:graphicData uri="http://schemas.openxmlformats.org/drawingml/2006/picture">
-                <pic:pic xmlns:pic="http://schemas.openxmlformats.org/drawingml/2006/picture">
-                  <pic:nvPicPr>
-                    <pic:cNvPr id="15" name="Image 15"/>
-                    <pic:cNvPicPr/>
-                  </pic:nvPicPr>
-                  <pic:blipFill>
-                    <a:blip r:embed="rId10" cstate="print"/>
-                    <a:stretch>
-                      <a:fillRect/>
-                    </a:stretch>
-                  </pic:blipFill>
-                  <pic:spPr>
-                    <a:xfrm>
-                      <a:off x="0" y="0"/>
-                      <a:ext cx="229850" cy="176807"/>
-                    </a:xfrm>
-                    <a:prstGeom prst="rect">
-                      <a:avLst/>
-                    </a:prstGeom>
-                  </pic:spPr>
-                </pic:pic>
-              </a:graphicData>
-            </a:graphic>
-          </wp:anchor>
-        </w:drawing>
-      </w:r>
       <w:hyperlink r:id="rId11">
         <w:r>
-          <w:rPr>
-            <w:spacing w:val="-2"/>
-          </w:rPr>
           <w:t>grandbusiness2024@gmail.com</w:t>
         </w:r>
       </w:hyperlink>
       <w:r>
-        <w:tab/>
+        <w:t xml:space="preserve">  |  </w:t>
       </w:r>
       <w:r>
-        <w:rPr>
-          <w:spacing w:val="-6"/>
-          <w:position w:val="1"/>
-        </w:rPr>
-        <w:t>+971</w:t>
-      </w:r>
-      <w:r>
-        <w:rPr>
-          <w:spacing w:val="-5"/>
-          <w:position w:val="1"/>
-        </w:rPr>
-        <w:t xml:space="preserve"> </w:t>
-      </w:r>
-      <w:r>
-        <w:rPr>
-          <w:spacing w:val="-6"/>
-          <w:position w:val="1"/>
-        </w:rPr>
-        <w:t>50</w:t>
-      </w:r>
-      <w:r>
-        <w:rPr>
-          <w:spacing w:val="-5"/>
-          <w:position w:val="1"/>
-        </w:rPr>
-        <w:t xml:space="preserve"> </w:t>
-      </w:r>
-      <w:r>
-        <w:rPr>
-          <w:spacing w:val="-6"/>
-          <w:position w:val="1"/>
-        </w:rPr>
-        <w:t>280</w:t>
-      </w:r>
-      <w:r>
-        <w:rPr>
-          <w:spacing w:val="-5"/>
-          <w:position w:val="1"/>
-        </w:rPr>
-        <w:t xml:space="preserve"> </w:t>
-      </w:r>
-      <w:r>
-        <w:rPr>
-          <w:spacing w:val="-6"/>
-          <w:position w:val="1"/>
-        </w:rPr>
-        <w:t>0736</w:t>
+        <w:t xml:space="preserve">+971 50 280 0736</w:t>
       </w:r>
     </w:p>
     <w:sectPr>

</xml_diff>